<commit_message>
feat(ui): clean Google/Zoho blue theme with working dark mode across all roles
- MERIDIAN token system (light/dark) driven by data-theme attribute

- Persistent dark toggle on every authenticated page (jobseeker + employer)

- Fix dark-mode contrast: legacy gray-ramp remap, page <style> tokens, sidebar labels

- Fix invisible TOP badges and mojibake emoji in employer job-create form

- Config-driven marketing/site content; consistent StudAI Hire branding
</commit_message>
<xml_diff>
--- a/STUDAI_HIRE_TECHNICAL_AUDIT_REPORT v2.docx
+++ b/STUDAI_HIRE_TECHNICAL_AUDIT_REPORT v2.docx
@@ -6,8 +6,6 @@
       <w:pPr>
         <w:jc w:val="center"/>
       </w:pPr>
-      <w:bookmarkStart w:id="0" w:name="_GoBack"/>
-      <w:bookmarkEnd w:id="0"/>
       <w:r>
         <w:rPr>
           <w:b/>
@@ -202,14 +200,7 @@
                 <w:color w:val="202020"/>
                 <w:sz w:val="18"/>
               </w:rPr>
-              <w:t xml:space="preserve">AI-powered career development SaaS platform for </w:t>
-            </w:r>
-            <w:r>
-              <w:rPr>
-                <w:color w:val="202020"/>
-                <w:sz w:val="18"/>
-              </w:rPr>
-              <w:t>job seekers and employers — covering resume building, AI job matching, autonomous job applications, salary negotiation coaching, interview intelligence, and employer ATS/hiring pipeline management.</w:t>
+              <w:t>AI-powered career development SaaS platform for job seekers and employers — covering resume building, AI job matching, autonomous job applications, salary negotiation coaching, interview intelligence, and employer ATS/hiring pipeline management.</w:t>
             </w:r>
           </w:p>
         </w:tc>
@@ -285,14 +276,7 @@
                 <w:color w:val="202020"/>
                 <w:sz w:val="18"/>
               </w:rPr>
-              <w:t>Fron</w:t>
-            </w:r>
-            <w:r>
-              <w:rPr>
-                <w:color w:val="202020"/>
-                <w:sz w:val="18"/>
-              </w:rPr>
-              <w:t>tend Type</w:t>
+              <w:t>Frontend Type</w:t>
             </w:r>
           </w:p>
         </w:tc>
@@ -396,14 +380,7 @@
                 <w:color w:val="202020"/>
                 <w:sz w:val="18"/>
               </w:rPr>
-              <w:t>Azure App Service (Linux container) — https://studai-app-prod.azureweb</w:t>
-            </w:r>
-            <w:r>
-              <w:rPr>
-                <w:color w:val="202020"/>
-                <w:sz w:val="18"/>
-              </w:rPr>
-              <w:t>sites.net</w:t>
+              <w:t>Azure App Service (Linux container) — https://studai-app-prod.azurewebsites.net</w:t>
             </w:r>
           </w:p>
         </w:tc>
@@ -433,14 +410,7 @@
                 <w:color w:val="202020"/>
                 <w:sz w:val="18"/>
               </w:rPr>
-              <w:t>(1) Standard HTML form POSTs for web pages  (2) Livewire AJAX wire calls for reactive components  (3) Sanctum-authenticated JSON REST API for mobile/SPA consumption  (4) Custom API token (ApiTokenAuthentication middleware) for</w:t>
-            </w:r>
-            <w:r>
-              <w:rPr>
-                <w:color w:val="202020"/>
-                <w:sz w:val="18"/>
-              </w:rPr>
-              <w:t xml:space="preserve"> third-party employer integrations at /api/v1/*</w:t>
+              <w:t>(1) Standard HTML form POSTs for web pages  (2) Livewire AJAX wire calls for reactive components  (3) Sanctum-authenticated JSON REST API for mobile/SPA consumption  (4) Custom API token (ApiTokenAuthentication middleware) for third-party employer integrations at /api/v1/*</w:t>
             </w:r>
           </w:p>
         </w:tc>
@@ -569,14 +539,7 @@
                 <w:color w:val="202020"/>
                 <w:sz w:val="18"/>
               </w:rPr>
-              <w:t xml:space="preserve">Spatie laravel-permission ^6.22 (roles &amp; </w:t>
-            </w:r>
-            <w:r>
-              <w:rPr>
-                <w:color w:val="202020"/>
-                <w:sz w:val="18"/>
-              </w:rPr>
-              <w:t>abilities)</w:t>
+              <w:t>Spatie laravel-permission ^6.22 (roles &amp; abilities)</w:t>
             </w:r>
           </w:p>
         </w:tc>
@@ -666,14 +629,7 @@
                 <w:color w:val="202020"/>
                 <w:sz w:val="18"/>
               </w:rPr>
-              <w:t xml:space="preserve">Database-backed PHP </w:t>
-            </w:r>
-            <w:r>
-              <w:rPr>
-                <w:color w:val="202020"/>
-                <w:sz w:val="18"/>
-              </w:rPr>
-              <w:t>session (SESSION_DRIVER=database) for web; Sanctum personal access tokens for API</w:t>
+              <w:t>Database-backed PHP session (SESSION_DRIVER=database) for web; Sanctum personal access tokens for API</w:t>
             </w:r>
           </w:p>
         </w:tc>
@@ -733,14 +689,7 @@
                 <w:color w:val="202020"/>
                 <w:sz w:val="18"/>
               </w:rPr>
-              <w:t>Personal access tokens stored in</w:t>
-            </w:r>
-            <w:r>
-              <w:rPr>
-                <w:color w:val="202020"/>
-                <w:sz w:val="18"/>
-              </w:rPr>
-              <w:t xml:space="preserve"> personal_access_tokens table with tokenable_type, tokenable_id, name, token (hashed), abilities, expires_at</w:t>
+              <w:t>Personal access tokens stored in personal_access_tokens table with tokenable_type, tokenable_id, name, token (hashed), abilities, expires_at</w:t>
             </w:r>
           </w:p>
         </w:tc>
@@ -800,14 +749,7 @@
                 <w:color w:val="202020"/>
                 <w:sz w:val="18"/>
               </w:rPr>
-              <w:t>app/Http/Controllers/Auth/RegisteredUserControlle</w:t>
-            </w:r>
-            <w:r>
-              <w:rPr>
-                <w:color w:val="202020"/>
-                <w:sz w:val="18"/>
-              </w:rPr>
-              <w:t>r.php</w:t>
+              <w:t>app/Http/Controllers/Auth/RegisteredUserController.php</w:t>
             </w:r>
           </w:p>
         </w:tc>
@@ -877,14 +819,7 @@
           <w:color w:val="202020"/>
           <w:sz w:val="20"/>
         </w:rPr>
-        <w:t>Users have an account_type colu</w:t>
-      </w:r>
-      <w:r>
-        <w:rPr>
-          <w:color w:val="202020"/>
-          <w:sz w:val="20"/>
-        </w:rPr>
-        <w:t>mn: job_seeker | employer | admin</w:t>
+        <w:t>Users have an account_type column: job_seeker | employer | admin</w:t>
       </w:r>
     </w:p>
     <w:p>
@@ -923,34 +858,20 @@
           <w:color w:val="202020"/>
           <w:sz w:val="20"/>
         </w:rPr>
-        <w:t xml:space="preserve">The Company model (app/Models/Company.php) stores: </w:t>
-      </w:r>
-      <w:r>
-        <w:rPr>
-          <w:color w:val="202020"/>
-          <w:sz w:val="20"/>
-        </w:rPr>
-        <w:t>name, slug, logo, website, industry, company_size, founded_year, headquarters, description, is_verified, is_featured, ratings, review stats, contact details, LinkedIn URL, etc.</w:t>
-      </w:r>
-    </w:p>
-    <w:p>
-      <w:pPr>
-        <w:pStyle w:val="ListBullet"/>
-        <w:spacing w:after="40"/>
-      </w:pPr>
-      <w:r>
-        <w:rPr>
-          <w:color w:val="202020"/>
-          <w:sz w:val="20"/>
-        </w:rPr>
-        <w:t>No tenant isolation — all data is global; access is filtered by company_id in q</w:t>
-      </w:r>
-      <w:r>
-        <w:rPr>
-          <w:color w:val="202020"/>
-          <w:sz w:val="20"/>
-        </w:rPr>
-        <w:t>ueries</w:t>
+        <w:t>The Company model (app/Models/Company.php) stores: name, slug, logo, website, industry, company_size, founded_year, headquarters, description, is_verified, is_featured, ratings, review stats, contact details, LinkedIn URL, etc.</w:t>
+      </w:r>
+    </w:p>
+    <w:p>
+      <w:pPr>
+        <w:pStyle w:val="ListBullet"/>
+        <w:spacing w:after="40"/>
+      </w:pPr>
+      <w:r>
+        <w:rPr>
+          <w:color w:val="202020"/>
+          <w:sz w:val="20"/>
+        </w:rPr>
+        <w:t>No tenant isolation — all data is global; access is filtered by company_id in queries</w:t>
       </w:r>
     </w:p>
     <w:p>
@@ -977,15 +898,7 @@
           <w:color w:val="C0392B"/>
           <w:sz w:val="20"/>
         </w:rPr>
-        <w:t>⚠</w:t>
-      </w:r>
-      <w:r>
-        <w:rPr>
-          <w:b/>
-          <w:color w:val="C0392B"/>
-          <w:sz w:val="20"/>
-        </w:rPr>
-        <w:t xml:space="preserve">  Only ONE user can be the employer for a given company (no team/seats model). Multiple admins per company is NOT supported.</w:t>
+        <w:t>⚠  Only ONE user can be the employer for a given company (no team/seats model). Multiple admins per company is NOT supported.</w:t>
       </w:r>
     </w:p>
     <w:p>
@@ -1008,14 +921,7 @@
           <w:color w:val="202020"/>
           <w:sz w:val="20"/>
         </w:rPr>
-        <w:t>From migrations (0001_01_01_000</w:t>
-      </w:r>
-      <w:r>
-        <w:rPr>
-          <w:color w:val="202020"/>
-          <w:sz w:val="20"/>
-        </w:rPr>
-        <w:t>000_create_users_table.php + subsequent alter migrations):</w:t>
+        <w:t>From migrations (0001_01_01_000000_create_users_table.php + subsequent alter migrations):</w:t>
       </w:r>
     </w:p>
     <w:p>
@@ -1093,14 +999,7 @@
           <w:color w:val="202020"/>
           <w:sz w:val="20"/>
         </w:rPr>
-        <w:t>phone (varchar, nullable, encrypted at r</w:t>
-      </w:r>
-      <w:r>
-        <w:rPr>
-          <w:color w:val="202020"/>
-          <w:sz w:val="20"/>
-        </w:rPr>
-        <w:t>est)</w:t>
+        <w:t>phone (varchar, nullable, encrypted at rest)</w:t>
       </w:r>
     </w:p>
     <w:p>
@@ -1191,14 +1090,7 @@
           <w:color w:val="202020"/>
           <w:sz w:val="20"/>
         </w:rPr>
-        <w:t>tim</w:t>
-      </w:r>
-      <w:r>
-        <w:rPr>
-          <w:color w:val="202020"/>
-          <w:sz w:val="20"/>
-        </w:rPr>
-        <w:t>ezone (varchar, default: UTC)</w:t>
+        <w:t>timezone (varchar, default: UTC)</w:t>
       </w:r>
     </w:p>
     <w:p>
@@ -1433,14 +1325,7 @@
                 <w:color w:val="202020"/>
                 <w:sz w:val="18"/>
               </w:rPr>
-              <w:t xml:space="preserve">SQLite </w:t>
-            </w:r>
-            <w:r>
-              <w:rPr>
-                <w:color w:val="202020"/>
-                <w:sz w:val="18"/>
-              </w:rPr>
-              <w:t>(development default — overridden in production)</w:t>
+              <w:t>SQLite (development default — overridden in production)</w:t>
             </w:r>
           </w:p>
         </w:tc>
@@ -1649,14 +1534,7 @@
           <w:color w:val="202020"/>
           <w:sz w:val="20"/>
         </w:rPr>
-        <w:t>two_factor_authenticatio</w:t>
-      </w:r>
-      <w:r>
-        <w:rPr>
-          <w:color w:val="202020"/>
-          <w:sz w:val="20"/>
-        </w:rPr>
-        <w:t>ns</w:t>
+        <w:t>two_factor_authentications</w:t>
       </w:r>
     </w:p>
     <w:p>
@@ -2033,15 +1911,7 @@
           <w:color w:val="202020"/>
           <w:sz w:val="20"/>
         </w:rPr>
-        <w:t>Subscriptions &amp; P</w:t>
-      </w:r>
-      <w:r>
-        <w:rPr>
-          <w:b/>
-          <w:color w:val="202020"/>
-          <w:sz w:val="20"/>
-        </w:rPr>
-        <w:t>ayments</w:t>
+        <w:t>Subscriptions &amp; Payments</w:t>
       </w:r>
     </w:p>
     <w:p>
@@ -2757,15 +2627,7 @@
           <w:color w:val="202020"/>
           <w:sz w:val="20"/>
         </w:rPr>
-        <w:t>Interview In</w:t>
-      </w:r>
-      <w:r>
-        <w:rPr>
-          <w:b/>
-          <w:color w:val="202020"/>
-          <w:sz w:val="20"/>
-        </w:rPr>
-        <w:t>telligence</w:t>
+        <w:t>Interview Intelligence</w:t>
       </w:r>
     </w:p>
     <w:p>
@@ -3820,14 +3682,7 @@
           <w:color w:val="202020"/>
           <w:sz w:val="20"/>
         </w:rPr>
-        <w:t>mar</w:t>
-      </w:r>
-      <w:r>
-        <w:rPr>
-          <w:color w:val="202020"/>
-          <w:sz w:val="20"/>
-        </w:rPr>
-        <w:t>ketplace_escrows</w:t>
+        <w:t>marketplace_escrows</w:t>
       </w:r>
     </w:p>
     <w:p>
@@ -4179,14 +4034,7 @@
           <w:color w:val="202020"/>
           <w:sz w:val="20"/>
         </w:rPr>
-        <w:t>ev</w:t>
-      </w:r>
-      <w:r>
-        <w:rPr>
-          <w:color w:val="202020"/>
-          <w:sz w:val="20"/>
-        </w:rPr>
-        <w:t>ent_participants</w:t>
+        <w:t>event_participants</w:t>
       </w:r>
     </w:p>
     <w:p>
@@ -4525,14 +4373,7 @@
           <w:sz w:val="20"/>
         </w:rPr>
         <w:lastRenderedPageBreak/>
-        <w:t>team_dynami</w:t>
-      </w:r>
-      <w:r>
-        <w:rPr>
-          <w:color w:val="202020"/>
-          <w:sz w:val="20"/>
-        </w:rPr>
-        <w:t>cs</w:t>
+        <w:t>team_dynamics</w:t>
       </w:r>
     </w:p>
     <w:p>
@@ -4701,14 +4542,7 @@
           <w:color w:val="202020"/>
           <w:sz w:val="20"/>
         </w:rPr>
-        <w:t>backgr</w:t>
-      </w:r>
-      <w:r>
-        <w:rPr>
-          <w:color w:val="202020"/>
-          <w:sz w:val="20"/>
-        </w:rPr>
-        <w:t>ound_check_packages</w:t>
+        <w:t>background_check_packages</w:t>
       </w:r>
     </w:p>
     <w:p>
@@ -5033,14 +4867,7 @@
           <w:color w:val="202020"/>
           <w:sz w:val="20"/>
         </w:rPr>
-        <w:t>benefits_pac</w:t>
-      </w:r>
-      <w:r>
-        <w:rPr>
-          <w:color w:val="202020"/>
-          <w:sz w:val="20"/>
-        </w:rPr>
-        <w:t>kages</w:t>
+        <w:t>benefits_packages</w:t>
       </w:r>
     </w:p>
     <w:p>
@@ -5220,21 +5047,7 @@
           <w:color w:val="D37B00"/>
           <w:sz w:val="20"/>
         </w:rPr>
-        <w:t>ℹ</w:t>
-      </w:r>
-      <w:r>
-        <w:rPr>
-          <w:color w:val="D37B00"/>
-          <w:sz w:val="20"/>
-        </w:rPr>
-        <w:t xml:space="preserve">  Full column list in Section 2.3 </w:t>
-      </w:r>
-      <w:r>
-        <w:rPr>
-          <w:color w:val="D37B00"/>
-          <w:sz w:val="20"/>
-        </w:rPr>
-        <w:t>above.</w:t>
+        <w:t>ℹ  Full column list in Section 2.3 above.</w:t>
       </w:r>
     </w:p>
     <w:p>
@@ -5286,14 +5099,7 @@
           <w:color w:val="202020"/>
           <w:sz w:val="20"/>
         </w:rPr>
-        <w:t>follower_count (int), review_count, salary_count, interv</w:t>
-      </w:r>
-      <w:r>
-        <w:rPr>
-          <w:color w:val="202020"/>
-          <w:sz w:val="20"/>
-        </w:rPr>
-        <w:t>iew_count</w:t>
+        <w:t>follower_count (int), review_count, salary_count, interview_count</w:t>
       </w:r>
     </w:p>
     <w:p>
@@ -5358,14 +5164,7 @@
           <w:color w:val="202020"/>
           <w:sz w:val="20"/>
         </w:rPr>
-        <w:t>company_email, hr_email, contact_phone, linkedin</w:t>
-      </w:r>
-      <w:r>
-        <w:rPr>
-          <w:color w:val="202020"/>
-          <w:sz w:val="20"/>
-        </w:rPr>
-        <w:t>_url, culture, deleted_at, created_at, updated_at</w:t>
+        <w:t>company_email, hr_email, contact_phone, linkedin_url, culture, deleted_at, created_at, updated_at</w:t>
       </w:r>
     </w:p>
     <w:p>
@@ -5417,14 +5216,7 @@
           <w:color w:val="202020"/>
           <w:sz w:val="20"/>
         </w:rPr>
-        <w:t>employment_type (full-time/part-time/c</w:t>
-      </w:r>
-      <w:r>
-        <w:rPr>
-          <w:color w:val="202020"/>
-          <w:sz w:val="20"/>
-        </w:rPr>
-        <w:t>ontract/internship/remote/freelance/temporary)</w:t>
+        <w:t>employment_type (full-time/part-time/contract/internship/remote/freelance/temporary)</w:t>
       </w:r>
     </w:p>
     <w:p>
@@ -5476,14 +5268,7 @@
           <w:color w:val="202020"/>
           <w:sz w:val="20"/>
         </w:rPr>
-        <w:t xml:space="preserve">responsibilities (json), </w:t>
-      </w:r>
-      <w:r>
-        <w:rPr>
-          <w:color w:val="202020"/>
-          <w:sz w:val="20"/>
-        </w:rPr>
-        <w:t>qualifications (text), benefits (json)</w:t>
+        <w:t>responsibilities (json), qualifications (text), benefits (json)</w:t>
       </w:r>
     </w:p>
     <w:p>
@@ -5600,14 +5385,7 @@
           <w:color w:val="202020"/>
           <w:sz w:val="20"/>
         </w:rPr>
-        <w:t>target_hire_count (int), orin_generated_jd (json), orin_application_f</w:t>
-      </w:r>
-      <w:r>
-        <w:rPr>
-          <w:color w:val="202020"/>
-          <w:sz w:val="20"/>
-        </w:rPr>
-        <w:t>orm_fields (json)</w:t>
+        <w:t>target_hire_count (int), orin_generated_jd (json), orin_application_form_fields (json)</w:t>
       </w:r>
     </w:p>
     <w:p>
@@ -5672,15 +5450,7 @@
           <w:color w:val="202020"/>
           <w:sz w:val="20"/>
         </w:rPr>
-        <w:t>Application (app/Models/Ap</w:t>
-      </w:r>
-      <w:r>
-        <w:rPr>
-          <w:b/>
-          <w:color w:val="202020"/>
-          <w:sz w:val="20"/>
-        </w:rPr>
-        <w:t>plication.php)</w:t>
+        <w:t>Application (app/Models/Application.php)</w:t>
       </w:r>
     </w:p>
     <w:p>
@@ -5733,14 +5503,7 @@
           <w:sz w:val="20"/>
         </w:rPr>
         <w:lastRenderedPageBreak/>
-        <w:t>status_updated_at, status</w:t>
-      </w:r>
-      <w:r>
-        <w:rPr>
-          <w:color w:val="202020"/>
-          <w:sz w:val="20"/>
-        </w:rPr>
-        <w:t>_history (json), rejection_reason, ai_reason</w:t>
+        <w:t>status_updated_at, status_history (json), rejection_reason, ai_reason</w:t>
       </w:r>
     </w:p>
     <w:p>
@@ -5805,14 +5568,7 @@
           <w:color w:val="202020"/>
           <w:sz w:val="20"/>
         </w:rPr>
-        <w:t>beha</w:t>
-      </w:r>
-      <w:r>
-        <w:rPr>
-          <w:color w:val="202020"/>
-          <w:sz w:val="20"/>
-        </w:rPr>
-        <w:t>vioural_fit_score, final_rank_score (decimals), rank_position (int)</w:t>
+        <w:t>behavioural_fit_score, final_rank_score (decimals), rank_position (int)</w:t>
       </w:r>
     </w:p>
     <w:p>
@@ -5864,14 +5620,7 @@
           <w:color w:val="202020"/>
           <w:sz w:val="20"/>
         </w:rPr>
-        <w:t>acce</w:t>
-      </w:r>
-      <w:r>
-        <w:rPr>
-          <w:color w:val="202020"/>
-          <w:sz w:val="20"/>
-        </w:rPr>
-        <w:t>ss_token, is_guest_applicant (bool), guest_name, guest_email, guest_phone</w:t>
+        <w:t>access_token, is_guest_applicant (bool), guest_name, guest_email, guest_phone</w:t>
       </w:r>
     </w:p>
     <w:p>
@@ -5934,13 +5683,7 @@
         <w:rPr>
           <w:color w:val="202020"/>
         </w:rPr>
-        <w:t>3.3 company_id / tenant_id</w:t>
-      </w:r>
-      <w:r>
-        <w:rPr>
-          <w:color w:val="202020"/>
-        </w:rPr>
-        <w:t xml:space="preserve"> Occurrences</w:t>
+        <w:t>3.3 company_id / tenant_id Occurrences</w:t>
       </w:r>
     </w:p>
     <w:p>
@@ -6085,14 +5828,7 @@
                 <w:color w:val="202020"/>
                 <w:sz w:val="18"/>
               </w:rPr>
-              <w:t xml:space="preserve">company_id (FK → </w:t>
-            </w:r>
-            <w:r>
-              <w:rPr>
-                <w:color w:val="202020"/>
-                <w:sz w:val="18"/>
-              </w:rPr>
-              <w:t>companies)</w:t>
+              <w:t>company_id (FK → companies)</w:t>
             </w:r>
           </w:p>
         </w:tc>
@@ -6194,14 +5930,7 @@
                 <w:color w:val="202020"/>
                 <w:sz w:val="18"/>
               </w:rPr>
-              <w:t xml:space="preserve">migration: </w:t>
-            </w:r>
-            <w:r>
-              <w:rPr>
-                <w:color w:val="202020"/>
-                <w:sz w:val="18"/>
-              </w:rPr>
-              <w:t>2025_11_06_000002_create_scout_corporate_dna_tables.php</w:t>
+              <w:t>migration: 2025_11_06_000002_create_scout_corporate_dna_tables.php</w:t>
             </w:r>
           </w:p>
         </w:tc>
@@ -6289,14 +6018,7 @@
                 <w:color w:val="202020"/>
                 <w:sz w:val="18"/>
               </w:rPr>
-              <w:t>migration: 2025_11_06_</w:t>
-            </w:r>
-            <w:r>
-              <w:rPr>
-                <w:color w:val="202020"/>
-                <w:sz w:val="18"/>
-              </w:rPr>
-              <w:t>000003_create_scout_assessment_tables.php</w:t>
+              <w:t>migration: 2025_11_06_000003_create_scout_assessment_tables.php</w:t>
             </w:r>
           </w:p>
         </w:tc>
@@ -6384,14 +6106,7 @@
                 <w:color w:val="202020"/>
                 <w:sz w:val="18"/>
               </w:rPr>
-              <w:t>app/Http/Controllers/Employer/Em</w:t>
-            </w:r>
-            <w:r>
-              <w:rPr>
-                <w:color w:val="202020"/>
-                <w:sz w:val="18"/>
-              </w:rPr>
-              <w:t>ployerDashboardController.php</w:t>
+              <w:t>app/Http/Controllers/Employer/EmployerDashboardController.php</w:t>
             </w:r>
           </w:p>
         </w:tc>
@@ -6655,14 +6370,7 @@
                 <w:color w:val="202020"/>
                 <w:sz w:val="18"/>
               </w:rPr>
-              <w:t xml:space="preserve">API </w:t>
-            </w:r>
-            <w:r>
-              <w:rPr>
-                <w:color w:val="202020"/>
-                <w:sz w:val="18"/>
-              </w:rPr>
-              <w:t>Version</w:t>
+              <w:t>API Version</w:t>
             </w:r>
           </w:p>
         </w:tc>
@@ -6856,14 +6564,7 @@
                 <w:color w:val="202020"/>
                 <w:sz w:val="18"/>
               </w:rPr>
-              <w:t>openai-php/laravel ^0.17.1 installed but only used as</w:t>
-            </w:r>
-            <w:r>
-              <w:rPr>
-                <w:color w:val="202020"/>
-                <w:sz w:val="18"/>
-              </w:rPr>
-              <w:t xml:space="preserve"> compatibility shim via OpenAIService → AIService</w:t>
+              <w:t>openai-php/laravel ^0.17.1 installed but only used as compatibility shim via OpenAIService → AIService</w:t>
             </w:r>
           </w:p>
         </w:tc>
@@ -6880,44 +6581,20 @@
           <w:color w:val="C0392B"/>
           <w:sz w:val="20"/>
         </w:rPr>
-        <w:t>⚠</w:t>
-      </w:r>
+        <w:t>⚠  CRITICAL SECURITY: Azure OpenAI API key (e6e0bf0c61d14319a92bbc2d2a02f52f) and endpoint are HARDCODED as fallback values in config/ai.php lines 26-28 and in AIService.php lines 47-51. If AZURE_OPENAI_API_KEY env var is empty, the hardcoded key is used. This key must be rotated and removed from source code immediately.</w:t>
+      </w:r>
+    </w:p>
+    <w:p>
+      <w:pPr>
+        <w:spacing w:after="80"/>
+      </w:pPr>
       <w:r>
         <w:rPr>
           <w:b/>
           <w:color w:val="C0392B"/>
           <w:sz w:val="20"/>
         </w:rPr>
-        <w:t xml:space="preserve">  CRITICAL SECURITY: Azure OpenAI API key (e6e0bf0c61d14319a92bbc2d2a02f52f) and endpoint are HARDCODED as fallback values in config/ai.php lines 26-28 and in AIService.php lines 47-51. If AZURE_OPENAI_A</w:t>
-      </w:r>
-      <w:r>
-        <w:rPr>
-          <w:b/>
-          <w:color w:val="C0392B"/>
-          <w:sz w:val="20"/>
-        </w:rPr>
-        <w:t>PI_KEY env var is empty, the hardcoded key is used. This key must be rotated and removed from source code immediately.</w:t>
-      </w:r>
-    </w:p>
-    <w:p>
-      <w:pPr>
-        <w:spacing w:after="80"/>
-      </w:pPr>
-      <w:r>
-        <w:rPr>
-          <w:b/>
-          <w:color w:val="C0392B"/>
-          <w:sz w:val="20"/>
-        </w:rPr>
-        <w:t>⚠</w:t>
-      </w:r>
-      <w:r>
-        <w:rPr>
-          <w:b/>
-          <w:color w:val="C0392B"/>
-          <w:sz w:val="20"/>
-        </w:rPr>
-        <w:t xml:space="preserve">  Azure OpenAI endpoint URL is also hardcoded in the same location.</w:t>
+        <w:t>⚠  Azure OpenAI endpoint URL is also hardcoded in the same location.</w:t>
       </w:r>
     </w:p>
     <w:p>
@@ -7004,15 +6681,7 @@
                 <w:color w:val="FFFFFF"/>
                 <w:sz w:val="18"/>
               </w:rPr>
-              <w:t>P</w:t>
-            </w:r>
-            <w:r>
-              <w:rPr>
-                <w:b/>
-                <w:color w:val="FFFFFF"/>
-                <w:sz w:val="18"/>
-              </w:rPr>
-              <w:t>urpose</w:t>
+              <w:t>Purpose</w:t>
             </w:r>
           </w:p>
         </w:tc>
@@ -7186,14 +6855,7 @@
                 <w:color w:val="202020"/>
                 <w:sz w:val="18"/>
               </w:rPr>
-              <w:t>Full salary neg</w:t>
-            </w:r>
-            <w:r>
-              <w:rPr>
-                <w:color w:val="202020"/>
-                <w:sz w:val="18"/>
-              </w:rPr>
-              <w:t>otiation strategy generation</w:t>
+              <w:t>Full salary negotiation strategy generation</w:t>
             </w:r>
           </w:p>
         </w:tc>
@@ -7281,14 +6943,7 @@
                 <w:color w:val="202020"/>
                 <w:sz w:val="18"/>
               </w:rPr>
-              <w:t>generateScenario(), ev</w:t>
-            </w:r>
-            <w:r>
-              <w:rPr>
-                <w:color w:val="202020"/>
-                <w:sz w:val="18"/>
-              </w:rPr>
-              <w:t>aluateResponse()</w:t>
+              <w:t>generateScenario(), evaluateResponse()</w:t>
             </w:r>
           </w:p>
         </w:tc>
@@ -7404,14 +7059,7 @@
                 <w:color w:val="202020"/>
                 <w:sz w:val="18"/>
               </w:rPr>
-              <w:t xml:space="preserve">analyzeCandidate(), </w:t>
-            </w:r>
-            <w:r>
-              <w:rPr>
-                <w:color w:val="202020"/>
-                <w:sz w:val="18"/>
-              </w:rPr>
-              <w:t xml:space="preserve">analyzeSkillMatch(), analyzeCultureFit(), generateRecommendation(), </w:t>
+              <w:t xml:space="preserve">analyzeCandidate(), analyzeSkillMatch(), analyzeCultureFit(), generateRecommendation(), </w:t>
             </w:r>
             <w:r>
               <w:rPr>
@@ -7622,14 +7270,7 @@
                 <w:color w:val="202020"/>
                 <w:sz w:val="18"/>
               </w:rPr>
-              <w:t xml:space="preserve">Tailors resume content to </w:t>
-            </w:r>
-            <w:r>
-              <w:rPr>
-                <w:color w:val="202020"/>
-                <w:sz w:val="18"/>
-              </w:rPr>
-              <w:t>specific job</w:t>
+              <w:t>Tailors resume content to specific job</w:t>
             </w:r>
           </w:p>
         </w:tc>
@@ -7761,14 +7402,7 @@
                 <w:color w:val="202020"/>
                 <w:sz w:val="18"/>
               </w:rPr>
-              <w:t>app/Services</w:t>
-            </w:r>
-            <w:r>
-              <w:rPr>
-                <w:color w:val="202020"/>
-                <w:sz w:val="18"/>
-              </w:rPr>
-              <w:t>/AI/InterviewQuestionGenerator.php</w:t>
+              <w:t>app/Services/AI/InterviewQuestionGenerator.php</w:t>
             </w:r>
           </w:p>
         </w:tc>
@@ -7884,14 +7518,7 @@
                 <w:color w:val="202020"/>
                 <w:sz w:val="18"/>
               </w:rPr>
-              <w:t>app/Servi</w:t>
-            </w:r>
-            <w:r>
-              <w:rPr>
-                <w:color w:val="202020"/>
-                <w:sz w:val="18"/>
-              </w:rPr>
-              <w:t>ces/AI/CareerCoachService.php</w:t>
+              <w:t>app/Services/AI/CareerCoachService.php</w:t>
             </w:r>
           </w:p>
         </w:tc>
@@ -8137,14 +7764,7 @@
                 <w:color w:val="202020"/>
                 <w:sz w:val="18"/>
               </w:rPr>
-              <w:t>embed()</w:t>
-            </w:r>
-            <w:r>
-              <w:rPr>
-                <w:color w:val="202020"/>
-                <w:sz w:val="18"/>
-              </w:rPr>
-              <w:t>, getEmbedding()</w:t>
+              <w:t>embed(), getEmbedding()</w:t>
             </w:r>
           </w:p>
         </w:tc>
@@ -8362,14 +7982,7 @@
                 <w:color w:val="202020"/>
                 <w:sz w:val="18"/>
               </w:rPr>
-              <w:t>app/Services/AI/SkillTrendAnalysisService.p</w:t>
-            </w:r>
-            <w:r>
-              <w:rPr>
-                <w:color w:val="202020"/>
-                <w:sz w:val="18"/>
-              </w:rPr>
-              <w:t>hp</w:t>
+              <w:t>app/Services/AI/SkillTrendAnalysisService.php</w:t>
             </w:r>
           </w:p>
         </w:tc>
@@ -8499,14 +8112,7 @@
                 <w:color w:val="202020"/>
                 <w:sz w:val="18"/>
               </w:rPr>
-              <w:t xml:space="preserve">evaluateApplication(), </w:t>
-            </w:r>
-            <w:r>
-              <w:rPr>
-                <w:color w:val="202020"/>
-                <w:sz w:val="18"/>
-              </w:rPr>
-              <w:t>scoreCandidate()</w:t>
+              <w:t>evaluateApplication(), scoreCandidate()</w:t>
             </w:r>
           </w:p>
         </w:tc>
@@ -8891,14 +8497,7 @@
                 <w:color w:val="202020"/>
                 <w:sz w:val="18"/>
               </w:rPr>
-              <w:t xml:space="preserve">Manages DB-stored prompts with versioning and A/B </w:t>
-            </w:r>
-            <w:r>
-              <w:rPr>
-                <w:color w:val="202020"/>
-                <w:sz w:val="18"/>
-              </w:rPr>
-              <w:t>testing</w:t>
+              <w:t>Manages DB-stored prompts with versioning and A/B testing</w:t>
             </w:r>
           </w:p>
         </w:tc>
@@ -8996,34 +8595,20 @@
           <w:color w:val="202020"/>
           <w:sz w:val="20"/>
         </w:rPr>
-        <w:t xml:space="preserve">DB-stored prompts: </w:t>
-      </w:r>
-      <w:r>
-        <w:rPr>
-          <w:color w:val="202020"/>
-          <w:sz w:val="20"/>
-        </w:rPr>
-        <w:t>AIPrompt model (ai_prompts table) managed via PromptRegistryService. Prompts have name, system_prompt, template, variables, version, model_hint, temperature, max_tokens, is_active columns. Can be edited without code deployment.</w:t>
-      </w:r>
-    </w:p>
-    <w:p>
-      <w:pPr>
-        <w:pStyle w:val="ListBullet"/>
-        <w:spacing w:after="40"/>
-      </w:pPr>
-      <w:r>
-        <w:rPr>
-          <w:color w:val="202020"/>
-          <w:sz w:val="20"/>
-        </w:rPr>
-        <w:t xml:space="preserve">Inline prompts: Embedded as </w:t>
-      </w:r>
-      <w:r>
-        <w:rPr>
-          <w:color w:val="202020"/>
-          <w:sz w:val="20"/>
-        </w:rPr>
-        <w:t>PHP strings directly in service methods (e.g., NegotiationStrategistService::gatherMarketResearch uses a hardcoded prompt string for salary benchmarking). These require code changes to modify.</w:t>
+        <w:t>DB-stored prompts: AIPrompt model (ai_prompts table) managed via PromptRegistryService. Prompts have name, system_prompt, template, variables, version, model_hint, temperature, max_tokens, is_active columns. Can be edited without code deployment.</w:t>
+      </w:r>
+    </w:p>
+    <w:p>
+      <w:pPr>
+        <w:pStyle w:val="ListBullet"/>
+        <w:spacing w:after="40"/>
+      </w:pPr>
+      <w:r>
+        <w:rPr>
+          <w:color w:val="202020"/>
+          <w:sz w:val="20"/>
+        </w:rPr>
+        <w:t>Inline prompts: Embedded as PHP strings directly in service methods (e.g., NegotiationStrategistService::gatherMarketResearch uses a hardcoded prompt string for salary benchmarking). These require code changes to modify.</w:t>
       </w:r>
     </w:p>
     <w:p>
@@ -9035,47 +8620,19 @@
           <w:color w:val="D37B00"/>
           <w:sz w:val="20"/>
         </w:rPr>
-        <w:t>ℹ</w:t>
-      </w:r>
+        <w:t>ℹ  Example inline system prompt (NegotiationStrategistService): "You are a compensation intelligence analyst with deep knowledge of the Indian job market (2024-2025)..."</w:t>
+      </w:r>
+    </w:p>
+    <w:p>
+      <w:pPr>
+        <w:spacing w:after="80"/>
+      </w:pPr>
       <w:r>
         <w:rPr>
           <w:color w:val="D37B00"/>
           <w:sz w:val="20"/>
         </w:rPr>
-        <w:t xml:space="preserve">  Example inline system prompt (NegotiationStrategistService):</w:t>
-      </w:r>
-      <w:r>
-        <w:rPr>
-          <w:color w:val="D37B00"/>
-          <w:sz w:val="20"/>
-        </w:rPr>
-        <w:t xml:space="preserve"> "You are a compensation intelligence analyst with deep knowledge of the Indian job market (2024-2025)..."</w:t>
-      </w:r>
-    </w:p>
-    <w:p>
-      <w:pPr>
-        <w:spacing w:after="80"/>
-      </w:pPr>
-      <w:r>
-        <w:rPr>
-          <w:color w:val="D37B00"/>
-          <w:sz w:val="20"/>
-        </w:rPr>
-        <w:t>ℹ</w:t>
-      </w:r>
-      <w:r>
-        <w:rPr>
-          <w:color w:val="D37B00"/>
-          <w:sz w:val="20"/>
-        </w:rPr>
-        <w:t xml:space="preserve">  All AI calls pass through AIService which builds the messages array. System prompts are passed as role: "system" messages. User input (resume text</w:t>
-      </w:r>
-      <w:r>
-        <w:rPr>
-          <w:color w:val="D37B00"/>
-          <w:sz w:val="20"/>
-        </w:rPr>
-        <w:t>, job data, salary figures) is passed as role: "user" messages.</w:t>
+        <w:t>ℹ  All AI calls pass through AIService which builds the messages array. System prompts are passed as role: "system" messages. User input (resume text, job data, salary figures) is passed as role: "user" messages.</w:t>
       </w:r>
     </w:p>
     <w:p>
@@ -9218,14 +8775,7 @@
                 <w:color w:val="202020"/>
                 <w:sz w:val="18"/>
               </w:rPr>
-              <w:t>Azure OpenAI AP</w:t>
-            </w:r>
-            <w:r>
-              <w:rPr>
-                <w:color w:val="202020"/>
-                <w:sz w:val="18"/>
-              </w:rPr>
-              <w:t>I key (primary)</w:t>
+              <w:t>Azure OpenAI API key (primary)</w:t>
             </w:r>
           </w:p>
         </w:tc>
@@ -9616,14 +9166,7 @@
                 <w:color w:val="202020"/>
                 <w:sz w:val="18"/>
               </w:rPr>
-              <w:t xml:space="preserve">Enable/disable AI response </w:t>
-            </w:r>
-            <w:r>
-              <w:rPr>
-                <w:color w:val="202020"/>
-                <w:sz w:val="18"/>
-              </w:rPr>
-              <w:t>caching</w:t>
+              <w:t>Enable/disable AI response caching</w:t>
             </w:r>
           </w:p>
         </w:tc>
@@ -9773,14 +9316,7 @@
                 <w:color w:val="202020"/>
                 <w:sz w:val="18"/>
               </w:rPr>
-              <w:t xml:space="preserve">Legacy OpenAI direct key </w:t>
-            </w:r>
-            <w:r>
-              <w:rPr>
-                <w:color w:val="202020"/>
-                <w:sz w:val="18"/>
-              </w:rPr>
-              <w:t>(optional)</w:t>
+              <w:t>Legacy OpenAI direct key (optional)</w:t>
             </w:r>
           </w:p>
         </w:tc>
@@ -10377,14 +9913,7 @@
                 <w:color w:val="202020"/>
                 <w:sz w:val="18"/>
               </w:rPr>
-              <w:t xml:space="preserve">Submit </w:t>
-            </w:r>
-            <w:r>
-              <w:rPr>
-                <w:color w:val="202020"/>
-                <w:sz w:val="18"/>
-              </w:rPr>
-              <w:t>public application</w:t>
+              <w:t>Submit public application</w:t>
             </w:r>
           </w:p>
         </w:tc>
@@ -10591,15 +10120,7 @@
                 <w:color w:val="FFFFFF"/>
                 <w:sz w:val="18"/>
               </w:rPr>
-              <w:t>Descript</w:t>
-            </w:r>
-            <w:r>
-              <w:rPr>
-                <w:b/>
-                <w:color w:val="FFFFFF"/>
-                <w:sz w:val="18"/>
-              </w:rPr>
-              <w:t>ion</w:t>
+              <w:t>Description</w:t>
             </w:r>
           </w:p>
         </w:tc>
@@ -11572,14 +11093,7 @@
                 <w:color w:val="202020"/>
                 <w:sz w:val="18"/>
               </w:rPr>
-              <w:t>InterviewSe</w:t>
-            </w:r>
-            <w:r>
-              <w:rPr>
-                <w:color w:val="202020"/>
-                <w:sz w:val="18"/>
-              </w:rPr>
-              <w:t>ssionController@submitAnswer</w:t>
+              <w:t>InterviewSessionController@submitAnswer</w:t>
             </w:r>
           </w:p>
         </w:tc>
@@ -11709,14 +11223,7 @@
                 <w:color w:val="202020"/>
                 <w:sz w:val="18"/>
               </w:rPr>
-              <w:t xml:space="preserve">Autonomous agent config, activate, </w:t>
-            </w:r>
-            <w:r>
-              <w:rPr>
-                <w:color w:val="202020"/>
-                <w:sz w:val="18"/>
-              </w:rPr>
-              <w:t>pause, status, metrics</w:t>
+              <w:t>Autonomous agent config, activate, pause, status, metrics</w:t>
             </w:r>
           </w:p>
         </w:tc>
@@ -11901,6 +11408,7 @@
             <w:tcW w:w="1152" w:type="dxa"/>
           </w:tcPr>
           <w:p>
+            <w:bookmarkStart w:id="0" w:name="_GoBack"/>
             <w:r>
               <w:rPr>
                 <w:color w:val="202020"/>
@@ -11992,14 +11500,7 @@
                 <w:color w:val="202020"/>
                 <w:sz w:val="18"/>
               </w:rPr>
-              <w:t>SkillAnalyzerController@generateAsse</w:t>
-            </w:r>
-            <w:r>
-              <w:rPr>
-                <w:color w:val="202020"/>
-                <w:sz w:val="18"/>
-              </w:rPr>
-              <w:t>ssment</w:t>
+              <w:t>SkillAnalyzerController@generateAssessment</w:t>
             </w:r>
           </w:p>
         </w:tc>
@@ -12098,14 +11599,7 @@
           <w:color w:val="202020"/>
           <w:sz w:val="20"/>
         </w:rPr>
-        <w:t>Prefix: /api/v1/ — uses ApiTokenAuthentication + ApiRateLimiting middleware. Ability-based access</w:t>
-      </w:r>
-      <w:r>
-        <w:rPr>
-          <w:color w:val="202020"/>
-          <w:sz w:val="20"/>
-        </w:rPr>
-        <w:t xml:space="preserve"> control via ApiAbilityCheck.</w:t>
+        <w:t>Prefix: /api/v1/ — uses ApiTokenAuthentication + ApiRateLimiting middleware. Ability-based access control via ApiAbilityCheck.</w:t>
       </w:r>
     </w:p>
     <w:tbl>
@@ -12356,14 +11850,7 @@
                 <w:color w:val="202020"/>
                 <w:sz w:val="18"/>
               </w:rPr>
-              <w:t>Update company</w:t>
-            </w:r>
-            <w:r>
-              <w:rPr>
-                <w:color w:val="202020"/>
-                <w:sz w:val="18"/>
-              </w:rPr>
-              <w:t xml:space="preserve"> profile</w:t>
+              <w:t>Update company profile</w:t>
             </w:r>
           </w:p>
         </w:tc>
@@ -12857,14 +12344,7 @@
                 <w:color w:val="202020"/>
                 <w:sz w:val="18"/>
               </w:rPr>
-              <w:t>/api/v1/applications/{app}/statu</w:t>
-            </w:r>
-            <w:r>
-              <w:rPr>
-                <w:color w:val="202020"/>
-                <w:sz w:val="18"/>
-              </w:rPr>
-              <w:t>s</w:t>
+              <w:t>/api/v1/applications/{app}/status</w:t>
             </w:r>
           </w:p>
         </w:tc>
@@ -13522,6 +13002,7 @@
           </w:p>
         </w:tc>
       </w:tr>
+      <w:bookmarkEnd w:id="0"/>
     </w:tbl>
     <w:p/>
     <w:p>
@@ -13724,14 +13205,7 @@
                 <w:color w:val="202020"/>
                 <w:sz w:val="18"/>
               </w:rPr>
-              <w:t xml:space="preserve">Razorpay events: payment.captured, </w:t>
-            </w:r>
-            <w:r>
-              <w:rPr>
-                <w:color w:val="202020"/>
-                <w:sz w:val="18"/>
-              </w:rPr>
-              <w:t>payment.failed</w:t>
+              <w:t>Razorpay events: payment.captured, payment.failed</w:t>
             </w:r>
           </w:p>
         </w:tc>
@@ -13816,14 +13290,7 @@
           <w:color w:val="202020"/>
           <w:sz w:val="20"/>
         </w:rPr>
-        <w:t>Partial versioning: /api/v1/ prefix exists exclusively for the third-party employer integration API. All internal Sanctum routes (/api/*) are unv</w:t>
-      </w:r>
-      <w:r>
-        <w:rPr>
-          <w:color w:val="202020"/>
-          <w:sz w:val="20"/>
-        </w:rPr>
-        <w:t>ersioned. No /api/v2/ exists.</w:t>
+        <w:t>Partial versioning: /api/v1/ prefix exists exclusively for the third-party employer integration API. All internal Sanctum routes (/api/*) are unversioned. No /api/v2/ exists.</w:t>
       </w:r>
     </w:p>
     <w:p>
@@ -13884,14 +13351,7 @@
           <w:color w:val="202020"/>
           <w:sz w:val="20"/>
         </w:rPr>
-        <w:t>Applications (applications table) — the core tran</w:t>
-      </w:r>
-      <w:r>
-        <w:rPr>
-          <w:color w:val="202020"/>
-          <w:sz w:val="20"/>
-        </w:rPr>
-        <w:t>sactional entity connecting candidates to jobs</w:t>
+        <w:t>Applications (applications table) — the core transactional entity connecting candidates to jobs</w:t>
       </w:r>
     </w:p>
     <w:p>
@@ -14034,14 +13494,7 @@
                 <w:color w:val="202020"/>
                 <w:sz w:val="18"/>
               </w:rPr>
-              <w:t>ApplicantTrackin</w:t>
-            </w:r>
-            <w:r>
-              <w:rPr>
-                <w:color w:val="202020"/>
-                <w:sz w:val="18"/>
-              </w:rPr>
-              <w:t>gController</w:t>
+              <w:t>ApplicantTrackingController</w:t>
             </w:r>
           </w:p>
         </w:tc>
@@ -14069,14 +13522,7 @@
                 <w:color w:val="202020"/>
                 <w:sz w:val="18"/>
               </w:rPr>
-              <w:t>Full ATS: list/filter applicants, update status (shortlist/hire/reject), bulk actions, schedule interviews, compare candidates, add notes, export CSV. Triggers notifications and queu</w:t>
-            </w:r>
-            <w:r>
-              <w:rPr>
-                <w:color w:val="202020"/>
-                <w:sz w:val="18"/>
-              </w:rPr>
-              <w:t>ed hiring emails.</w:t>
+              <w:t>Full ATS: list/filter applicants, update status (shortlist/hire/reject), bulk actions, schedule interviews, compare candidates, add notes, export CSV. Triggers notifications and queued hiring emails.</w:t>
             </w:r>
           </w:p>
         </w:tc>
@@ -14120,14 +13566,7 @@
                 <w:color w:val="202020"/>
                 <w:sz w:val="18"/>
               </w:rPr>
-              <w:t>Employer job CRUD: create/edit/publish/close job listings. Includes AI-content generation (description, requirements, questions from just the job title). Manages</w:t>
-            </w:r>
-            <w:r>
-              <w:rPr>
-                <w:color w:val="202020"/>
-                <w:sz w:val="18"/>
-              </w:rPr>
-              <w:t xml:space="preserve"> Orin™ evaluation pipeline dates.</w:t>
+              <w:t>Employer job CRUD: create/edit/publish/close job listings. Includes AI-content generation (description, requirements, questions from just the job title). Manages Orin™ evaluation pipeline dates.</w:t>
             </w:r>
           </w:p>
         </w:tc>
@@ -14171,14 +13610,7 @@
                 <w:color w:val="202020"/>
                 <w:sz w:val="18"/>
               </w:rPr>
-              <w:t xml:space="preserve">Job seeker home page: application stats, recent applications, recommended jobs, subscription status, profile completion. Redirects employers to </w:t>
-            </w:r>
-            <w:r>
-              <w:rPr>
-                <w:color w:val="202020"/>
-                <w:sz w:val="18"/>
-              </w:rPr>
-              <w:t>employer.dashboard.</w:t>
+              <w:t>Job seeker home page: application stats, recent applications, recommended jobs, subscription status, profile completion. Redirects employers to employer.dashboard.</w:t>
             </w:r>
           </w:p>
         </w:tc>
@@ -14238,14 +13670,7 @@
                 <w:color w:val="202020"/>
                 <w:sz w:val="18"/>
               </w:rPr>
-              <w:t>AgentCo</w:t>
-            </w:r>
-            <w:r>
-              <w:rPr>
-                <w:color w:val="202020"/>
-                <w:sz w:val="18"/>
-              </w:rPr>
-              <w:t>ntroller (API)</w:t>
+              <w:t>AgentController (API)</w:t>
             </w:r>
           </w:p>
         </w:tc>
@@ -14289,14 +13714,7 @@
                 <w:color w:val="202020"/>
                 <w:sz w:val="18"/>
               </w:rPr>
-              <w:t xml:space="preserve">NegotiationController </w:t>
-            </w:r>
-            <w:r>
-              <w:rPr>
-                <w:color w:val="202020"/>
-                <w:sz w:val="18"/>
-              </w:rPr>
-              <w:t>(API)</w:t>
+              <w:t>NegotiationController (API)</w:t>
             </w:r>
           </w:p>
         </w:tc>
@@ -14503,14 +13921,7 @@
                 <w:sz w:val="18"/>
               </w:rPr>
               <w:lastRenderedPageBreak/>
-              <w:t>SubmitApplicationsJo</w:t>
-            </w:r>
-            <w:r>
-              <w:rPr>
-                <w:color w:val="202020"/>
-                <w:sz w:val="18"/>
-              </w:rPr>
-              <w:t>b</w:t>
+              <w:t>SubmitApplicationsJob</w:t>
             </w:r>
           </w:p>
         </w:tc>
@@ -14626,14 +14037,7 @@
                 <w:color w:val="202020"/>
                 <w:sz w:val="18"/>
               </w:rPr>
-              <w:t xml:space="preserve">Sends daily/weekly digest of agent </w:t>
-            </w:r>
-            <w:r>
-              <w:rPr>
-                <w:color w:val="202020"/>
-                <w:sz w:val="18"/>
-              </w:rPr>
-              <w:t>activity to users</w:t>
+              <w:t>Sends daily/weekly digest of agent activity to users</w:t>
             </w:r>
           </w:p>
         </w:tc>
@@ -14765,14 +14169,7 @@
                 <w:color w:val="202020"/>
                 <w:sz w:val="18"/>
               </w:rPr>
-              <w:t>Computes AI match s</w:t>
-            </w:r>
-            <w:r>
-              <w:rPr>
-                <w:color w:val="202020"/>
-                <w:sz w:val="18"/>
-              </w:rPr>
-              <w:t>cores for all candidates on a job</w:t>
+              <w:t>Computes AI match scores for all candidates on a job</w:t>
             </w:r>
           </w:p>
         </w:tc>
@@ -15256,14 +14653,7 @@
                 <w:color w:val="202020"/>
                 <w:sz w:val="18"/>
               </w:rPr>
-              <w:t>Azure STT transcription of video interview re</w:t>
-            </w:r>
-            <w:r>
-              <w:rPr>
-                <w:color w:val="202020"/>
-                <w:sz w:val="18"/>
-              </w:rPr>
-              <w:t>cording</w:t>
+              <w:t>Azure STT transcription of video interview recording</w:t>
             </w:r>
           </w:p>
         </w:tc>
@@ -15395,14 +14785,7 @@
                 <w:color w:val="202020"/>
                 <w:sz w:val="18"/>
               </w:rPr>
-              <w:t xml:space="preserve">Refreshes predictive analytics (tenure </w:t>
-            </w:r>
-            <w:r>
-              <w:rPr>
-                <w:color w:val="202020"/>
-                <w:sz w:val="18"/>
-              </w:rPr>
-              <w:t>forecast, flight risk, success predictions)</w:t>
+              <w:t>Refreshes predictive analytics (tenure forecast, flight risk, success predictions)</w:t>
             </w:r>
           </w:p>
         </w:tc>
@@ -15534,14 +14917,7 @@
                 <w:color w:val="202020"/>
                 <w:sz w:val="18"/>
               </w:rPr>
-              <w:t>Retries failed su</w:t>
-            </w:r>
-            <w:r>
-              <w:rPr>
-                <w:color w:val="202020"/>
-                <w:sz w:val="18"/>
-              </w:rPr>
-              <w:t>bscription payment with backoff</w:t>
+              <w:t>Retries failed subscription payment with backoff</w:t>
             </w:r>
           </w:p>
         </w:tc>
@@ -15909,14 +15285,7 @@
                 <w:color w:val="202020"/>
                 <w:sz w:val="18"/>
               </w:rPr>
-              <w:t>app/Http/Controllers/PaymentWebhookController</w:t>
-            </w:r>
-            <w:r>
-              <w:rPr>
-                <w:color w:val="202020"/>
-                <w:sz w:val="18"/>
-              </w:rPr>
-              <w:t>.php</w:t>
+              <w:t>app/Http/Controllers/PaymentWebhookController.php</w:t>
             </w:r>
           </w:p>
         </w:tc>
@@ -16072,14 +15441,7 @@
           <w:color w:val="202020"/>
           <w:sz w:val="20"/>
         </w:rPr>
-        <w:t xml:space="preserve">APP_NAME, APP_ENV, APP_KEY, </w:t>
-      </w:r>
-      <w:r>
-        <w:rPr>
-          <w:color w:val="202020"/>
-          <w:sz w:val="20"/>
-        </w:rPr>
-        <w:t>APP_DEBUG, APP_URL, APP_LOCALE, APP_FALLBACK_LOCALE, APP_FAKER_LOCALE, APP_MAINTENANCE_DRIVER, PHP_CLI_SERVER_WORKERS, BCRYPT_ROUNDS</w:t>
+        <w:t>APP_NAME, APP_ENV, APP_KEY, APP_DEBUG, APP_URL, APP_LOCALE, APP_FALLBACK_LOCALE, APP_FAKER_LOCALE, APP_MAINTENANCE_DRIVER, PHP_CLI_SERVER_WORKERS, BCRYPT_ROUNDS</w:t>
       </w:r>
     </w:p>
     <w:p>
@@ -16131,14 +15493,7 @@
           <w:color w:val="202020"/>
           <w:sz w:val="20"/>
         </w:rPr>
-        <w:t xml:space="preserve">DB_CONNECTION, DB_HOST, DB_PORT, DB_DATABASE, </w:t>
-      </w:r>
-      <w:r>
-        <w:rPr>
-          <w:color w:val="202020"/>
-          <w:sz w:val="20"/>
-        </w:rPr>
-        <w:t>DB_USERNAME, DB_PASSWORD</w:t>
+        <w:t>DB_CONNECTION, DB_HOST, DB_PORT, DB_DATABASE, DB_USERNAME, DB_PASSWORD</w:t>
       </w:r>
     </w:p>
     <w:p>
@@ -16190,14 +15545,7 @@
           <w:color w:val="202020"/>
           <w:sz w:val="20"/>
         </w:rPr>
-        <w:t>REDIS_CLIENT, REDIS_HOST, REDIS_PASSW</w:t>
-      </w:r>
-      <w:r>
-        <w:rPr>
-          <w:color w:val="202020"/>
-          <w:sz w:val="20"/>
-        </w:rPr>
-        <w:t>ORD, REDIS_PORT</w:t>
+        <w:t>REDIS_CLIENT, REDIS_HOST, REDIS_PASSWORD, REDIS_PORT</w:t>
       </w:r>
     </w:p>
     <w:p>
@@ -16249,14 +15597,7 @@
           <w:color w:val="202020"/>
           <w:sz w:val="20"/>
         </w:rPr>
-        <w:t>AWS_ACCESS_KEY_ID, AWS_SECRET_ACCESS_KEY, AWS_DEFAULT_REGION, AWS_BUCKET, AWS_USE_PATH_STYLE_ENDPOIN</w:t>
-      </w:r>
-      <w:r>
-        <w:rPr>
-          <w:color w:val="202020"/>
-          <w:sz w:val="20"/>
-        </w:rPr>
-        <w:t>T, AZURE_STORAGE_ACCOUNT, AZURE_STORAGE_KEY, AZURE_STORAGE_CONTAINER</w:t>
+        <w:t>AWS_ACCESS_KEY_ID, AWS_SECRET_ACCESS_KEY, AWS_DEFAULT_REGION, AWS_BUCKET, AWS_USE_PATH_STYLE_ENDPOINT, AZURE_STORAGE_ACCOUNT, AZURE_STORAGE_KEY, AZURE_STORAGE_CONTAINER</w:t>
       </w:r>
     </w:p>
     <w:p>
@@ -16282,21 +15623,7 @@
           <w:color w:val="202020"/>
           <w:sz w:val="20"/>
         </w:rPr>
-        <w:t xml:space="preserve">AI_PRIMARY_PROVIDER, AI_FALLBACK_PROVIDER, AZURE_OPENAI_API_KEY, AZURE_OPENAI_ENDPOINT, AZURE_OPENAI_DEPLOYMENT_ID, AZURE_OPENAI_API_VERSION, AZURE_OPENAI_MODEL, </w:t>
-      </w:r>
-      <w:r>
-        <w:rPr>
-          <w:color w:val="202020"/>
-          <w:sz w:val="20"/>
-        </w:rPr>
-        <w:t xml:space="preserve">AZURE_OPENAI_MODEL_MINI, AI_MODEL_EMBEDDINGS, AZURE_ANTHROPIC_API_KEY, AZURE_ANTHROPIC_ENDPOINT, AZURE_ANTHROPIC_MODEL, ANTHROPIC_MAX_TOKENS, AI_MAX_TOKENS, AI_TEMPERATURE, AI_CACHE_ENABLED, AI_REQUEST_TIMEOUT, AI_EMBEDDINGS_TIMEOUT, AI_STREAMING_TIMEOUT, </w:t>
-      </w:r>
-      <w:r>
-        <w:rPr>
-          <w:color w:val="202020"/>
-          <w:sz w:val="20"/>
-        </w:rPr>
-        <w:t>AI_LONG_RUNNING_TIMEOUT, OPENAI_API_KEY, OPENAI_ORGANIZATION, OPENAI_REQUEST_TIMEOUT</w:t>
+        <w:t>AI_PRIMARY_PROVIDER, AI_FALLBACK_PROVIDER, AZURE_OPENAI_API_KEY, AZURE_OPENAI_ENDPOINT, AZURE_OPENAI_DEPLOYMENT_ID, AZURE_OPENAI_API_VERSION, AZURE_OPENAI_MODEL, AZURE_OPENAI_MODEL_MINI, AI_MODEL_EMBEDDINGS, AZURE_ANTHROPIC_API_KEY, AZURE_ANTHROPIC_ENDPOINT, AZURE_ANTHROPIC_MODEL, ANTHROPIC_MAX_TOKENS, AI_MAX_TOKENS, AI_TEMPERATURE, AI_CACHE_ENABLED, AI_REQUEST_TIMEOUT, AI_EMBEDDINGS_TIMEOUT, AI_STREAMING_TIMEOUT, AI_LONG_RUNNING_TIMEOUT, OPENAI_API_KEY, OPENAI_ORGANIZATION, OPENAI_REQUEST_TIMEOUT</w:t>
       </w:r>
     </w:p>
     <w:p>
@@ -16322,14 +15649,7 @@
           <w:color w:val="202020"/>
           <w:sz w:val="20"/>
         </w:rPr>
-        <w:t>PAYMENT_GATEWAY, RAZORPAY_KEY, RAZORPAY_SECRET, RAZORPAY_WEBHOOK_SECRET, RAZORPAY_CURRENCY, PAYU_MERCHANT_KEY, PAYU_MERCHANT_SALT, PAYU_MODE, PAYU_CURRENCY, PAYU_</w:t>
-      </w:r>
-      <w:r>
-        <w:rPr>
-          <w:color w:val="202020"/>
-          <w:sz w:val="20"/>
-        </w:rPr>
-        <w:t>SURL, PAYU_FURL, STRIPE_KEY, STRIPE_SECRET, STRIPE_WEBHOOK_SECRET</w:t>
+        <w:t>PAYMENT_GATEWAY, RAZORPAY_KEY, RAZORPAY_SECRET, RAZORPAY_WEBHOOK_SECRET, RAZORPAY_CURRENCY, PAYU_MERCHANT_KEY, PAYU_MERCHANT_SALT, PAYU_MODE, PAYU_CURRENCY, PAYU_SURL, PAYU_FURL, STRIPE_KEY, STRIPE_SECRET, STRIPE_WEBHOOK_SECRET</w:t>
       </w:r>
     </w:p>
     <w:p>
@@ -16381,14 +15701,7 @@
           <w:color w:val="202020"/>
           <w:sz w:val="20"/>
         </w:rPr>
-        <w:t>SENTRY_LARAVEL_DSN, SENTRY_ENVIRONMENT, SENTRY_TRACES_SAMPLE_RATE, SENTRY_PROFILES_SAMPLE_RATE, HORIZON_DOMAIN, HOR</w:t>
-      </w:r>
-      <w:r>
-        <w:rPr>
-          <w:color w:val="202020"/>
-          <w:sz w:val="20"/>
-        </w:rPr>
-        <w:t>IZON_PATH, HORIZON_PREFIX</w:t>
+        <w:t>SENTRY_LARAVEL_DSN, SENTRY_ENVIRONMENT, SENTRY_TRACES_SAMPLE_RATE, SENTRY_PROFILES_SAMPLE_RATE, HORIZON_DOMAIN, HORIZON_PATH, HORIZON_PREFIX</w:t>
       </w:r>
     </w:p>
     <w:p>
@@ -16467,14 +15780,7 @@
           <w:color w:val="202020"/>
           <w:sz w:val="20"/>
         </w:rPr>
-        <w:t xml:space="preserve">GOOGLE_CLIENT_ID, GOOGLE_CLIENT_SECRET, </w:t>
-      </w:r>
-      <w:r>
-        <w:rPr>
-          <w:color w:val="202020"/>
-          <w:sz w:val="20"/>
-        </w:rPr>
-        <w:t>GOOGLE_REDIRECT, LINKEDIN_CLIENT_ID, LINKEDIN_CLIENT_SECRET, GITHUB_CLIENT_ID, GITHUB_CLIENT_SECRET, MICROSOFT_CLIENT_ID, MICROSOFT_CLIENT_SECRET</w:t>
+        <w:t>GOOGLE_CLIENT_ID, GOOGLE_CLIENT_SECRET, GOOGLE_REDIRECT, LINKEDIN_CLIENT_ID, LINKEDIN_CLIENT_SECRET, GITHUB_CLIENT_ID, GITHUB_CLIENT_SECRET, MICROSOFT_CLIENT_ID, MICROSOFT_CLIENT_SECRET</w:t>
       </w:r>
     </w:p>
     <w:p>
@@ -16526,14 +15832,7 @@
           <w:color w:val="202020"/>
           <w:sz w:val="20"/>
         </w:rPr>
-        <w:t>VIDEO_INTERVIEW_PROVIDER, TWILIO_AC</w:t>
-      </w:r>
-      <w:r>
-        <w:rPr>
-          <w:color w:val="202020"/>
-          <w:sz w:val="20"/>
-        </w:rPr>
-        <w:t>COUNT_SID, TWILIO_AUTH_TOKEN, TWILIO_API_KEY, TWILIO_API_SECRET</w:t>
+        <w:t>VIDEO_INTERVIEW_PROVIDER, TWILIO_ACCOUNT_SID, TWILIO_AUTH_TOKEN, TWILIO_API_KEY, TWILIO_API_SECRET</w:t>
       </w:r>
     </w:p>
     <w:p>
@@ -16642,21 +15941,7 @@
                 <w:color w:val="202020"/>
                 <w:sz w:val="18"/>
               </w:rPr>
-              <w:t>AZURE_OPENAI_API_KEY, AZUR</w:t>
-            </w:r>
-            <w:r>
-              <w:rPr>
-                <w:color w:val="202020"/>
-                <w:sz w:val="18"/>
-              </w:rPr>
-              <w:t>E_OPENAI_ENDPOINT, AZURE_OPENAI_DEPLOYMENT_ID, AZURE_OPENAI_API_VERSION, AZURE_OPENAI_MODEL, AZURE_OPENAI_MODEL_MINI, AI_MODEL_EMBEDDINGS, AZURE_ANTHROPIC_API_KEY, AZURE_ANTHROPIC_ENDPOINT, AZURE_ANTHROPIC_MODEL, ANTHROPIC_MAX_TOKENS, AI_MAX_TOKENS, AI_TEM</w:t>
-            </w:r>
-            <w:r>
-              <w:rPr>
-                <w:color w:val="202020"/>
-                <w:sz w:val="18"/>
-              </w:rPr>
-              <w:t>PERATURE, AI_REQUEST_TIMEOUT, AI_PRIMARY_PROVIDER, AI_FALLBACK_PROVIDER, OPENAI_API_KEY (legacy)</w:t>
+              <w:t>AZURE_OPENAI_API_KEY, AZURE_OPENAI_ENDPOINT, AZURE_OPENAI_DEPLOYMENT_ID, AZURE_OPENAI_API_VERSION, AZURE_OPENAI_MODEL, AZURE_OPENAI_MODEL_MINI, AI_MODEL_EMBEDDINGS, AZURE_ANTHROPIC_API_KEY, AZURE_ANTHROPIC_ENDPOINT, AZURE_ANTHROPIC_MODEL, ANTHROPIC_MAX_TOKENS, AI_MAX_TOKENS, AI_TEMPERATURE, AI_REQUEST_TIMEOUT, AI_PRIMARY_PROVIDER, AI_FALLBACK_PROVIDER, OPENAI_API_KEY (legacy)</w:t>
             </w:r>
           </w:p>
         </w:tc>
@@ -16686,14 +15971,7 @@
                 <w:color w:val="202020"/>
                 <w:sz w:val="18"/>
               </w:rPr>
-              <w:t xml:space="preserve">RAZORPAY_KEY, RAZORPAY_SECRET, RAZORPAY_WEBHOOK_SECRET, RAZORPAY_CURRENCY, PAYU_MERCHANT_KEY, PAYU_MERCHANT_SALT, PAYU_MODE, STRIPE_KEY, </w:t>
-            </w:r>
-            <w:r>
-              <w:rPr>
-                <w:color w:val="202020"/>
-                <w:sz w:val="18"/>
-              </w:rPr>
-              <w:t>STRIPE_SECRET, STRIPE_WEBHOOK_SECRET, PAYMENT_GATEWAY</w:t>
+              <w:t>RAZORPAY_KEY, RAZORPAY_SECRET, RAZORPAY_WEBHOOK_SECRET, RAZORPAY_CURRENCY, PAYU_MERCHANT_KEY, PAYU_MERCHANT_SALT, PAYU_MODE, STRIPE_KEY, STRIPE_SECRET, STRIPE_WEBHOOK_SECRET, PAYMENT_GATEWAY</w:t>
             </w:r>
           </w:p>
         </w:tc>
@@ -16753,14 +16031,7 @@
                 <w:color w:val="202020"/>
                 <w:sz w:val="18"/>
               </w:rPr>
-              <w:t>GOOGLE_CLIENT_ID/SECRET, LINKEDIN_CLIENT_ID/SECRET, GITHUB_CLIENT_ID</w:t>
-            </w:r>
-            <w:r>
-              <w:rPr>
-                <w:color w:val="202020"/>
-                <w:sz w:val="18"/>
-              </w:rPr>
-              <w:t>/SECRET, MICROSOFT_CLIENT_ID/SECRET, TWILIO_ACCOUNT_SID/AUTH_TOKEN, MEILISEARCH_HOST/KEY, SENTRY_LARAVEL_DSN, VAPID_PUBLIC_KEY/PRIVATE_KEY, REVERB_APP_KEY/SECRET, BACKGROUND_CHECK_API_KEY</w:t>
+              <w:t>GOOGLE_CLIENT_ID/SECRET, LINKEDIN_CLIENT_ID/SECRET, GITHUB_CLIENT_ID/SECRET, MICROSOFT_CLIENT_ID/SECRET, TWILIO_ACCOUNT_SID/AUTH_TOKEN, MEILISEARCH_HOST/KEY, SENTRY_LARAVEL_DSN, VAPID_PUBLIC_KEY/PRIVATE_KEY, REVERB_APP_KEY/SECRET, BACKGROUND_CHECK_API_KEY</w:t>
             </w:r>
           </w:p>
         </w:tc>
@@ -16787,13 +16058,7 @@
         <w:rPr>
           <w:color w:val="202020"/>
         </w:rPr>
-        <w:t>8.1 Multi-User / Multi-Tenan</w:t>
-      </w:r>
-      <w:r>
-        <w:rPr>
-          <w:color w:val="202020"/>
-        </w:rPr>
-        <w:t>cy</w:t>
+        <w:t>8.1 Multi-User / Multi-Tenancy</w:t>
       </w:r>
     </w:p>
     <w:p>
@@ -16806,15 +16071,70 @@
           <w:color w:val="C0392B"/>
           <w:sz w:val="20"/>
         </w:rPr>
-        <w:t>⚠</w:t>
-      </w:r>
+        <w:t>⚠  No multi-tenancy: The platform has NO workspace/org/tenant isolation. All employer users share one database with filtering by company_id only.</w:t>
+      </w:r>
+    </w:p>
+    <w:p>
+      <w:pPr>
+        <w:spacing w:after="80"/>
+      </w:pPr>
       <w:r>
         <w:rPr>
           <w:b/>
           <w:color w:val="C0392B"/>
           <w:sz w:val="20"/>
         </w:rPr>
-        <w:t xml:space="preserve">  No multi-tenancy: The platform has NO workspace/org/tenant isolation. All employer users share one database with filtering by company_id only.</w:t>
+        <w:t>⚠  Single employer per company: Only one user account can be linked to each company (company_id FK on users). There is no team-seats model, no invitation system for colleagues, and no role differentiation within a company (e.g., HR vs. Hiring Manager vs. Admin).</w:t>
+      </w:r>
+    </w:p>
+    <w:p>
+      <w:pPr>
+        <w:pStyle w:val="ListBullet"/>
+        <w:spacing w:after="40"/>
+      </w:pPr>
+      <w:r>
+        <w:rPr>
+          <w:color w:val="202020"/>
+          <w:sz w:val="20"/>
+        </w:rPr>
+        <w:t>Job seekers: each account is independent — no multi-user consideration needed.</w:t>
+      </w:r>
+    </w:p>
+    <w:p>
+      <w:pPr>
+        <w:pStyle w:val="ListBullet"/>
+        <w:spacing w:after="40"/>
+      </w:pPr>
+      <w:r>
+        <w:rPr>
+          <w:color w:val="202020"/>
+          <w:sz w:val="20"/>
+        </w:rPr>
+        <w:t>Employers: a company exists as a shared entity but only one user (the employer) is linked to it.</w:t>
+      </w:r>
+    </w:p>
+    <w:p>
+      <w:pPr>
+        <w:spacing w:after="80"/>
+      </w:pPr>
+      <w:r>
+        <w:rPr>
+          <w:color w:val="D37B00"/>
+          <w:sz w:val="20"/>
+        </w:rPr>
+        <w:t>ℹ  Adding multi-seat employer teams would require: a company_users pivot table, role-within-company column, invitations system, and scoping all employer queries through team membership.</w:t>
+      </w:r>
+    </w:p>
+    <w:p>
+      <w:pPr>
+        <w:pStyle w:val="Heading2"/>
+      </w:pPr>
+      <w:r>
+        <w:rPr>
+          <w:color w:val="202020"/>
+        </w:rPr>
+        <w:lastRenderedPageBreak/>
+        <w:t>8.2 Hardcoded Values</w:t>
       </w:r>
     </w:p>
     <w:p>
@@ -16827,144 +16147,20 @@
           <w:color w:val="C0392B"/>
           <w:sz w:val="20"/>
         </w:rPr>
-        <w:t>⚠</w:t>
-      </w:r>
+        <w:t>⚠  CRITICAL: Azure OpenAI API key (e6e0bf0c61d14319a92bbc2d2a02f52f) hardcoded in config/ai.php (line 26) and AIService.php (line 51) as fallback values. Must be rotated and removed.</w:t>
+      </w:r>
+    </w:p>
+    <w:p>
+      <w:pPr>
+        <w:spacing w:after="80"/>
+      </w:pPr>
       <w:r>
         <w:rPr>
           <w:b/>
           <w:color w:val="C0392B"/>
           <w:sz w:val="20"/>
         </w:rPr>
-        <w:t xml:space="preserve">  Single employer per company: Only one user account can be linked to each company (company_id FK on users</w:t>
-      </w:r>
-      <w:r>
-        <w:rPr>
-          <w:b/>
-          <w:color w:val="C0392B"/>
-          <w:sz w:val="20"/>
-        </w:rPr>
-        <w:t>). There is no team-seats model, no invitation system for colleagues, and no role differentiation within a company (e.g., HR vs. Hiring Manager vs. Admin).</w:t>
-      </w:r>
-    </w:p>
-    <w:p>
-      <w:pPr>
-        <w:pStyle w:val="ListBullet"/>
-        <w:spacing w:after="40"/>
-      </w:pPr>
-      <w:r>
-        <w:rPr>
-          <w:color w:val="202020"/>
-          <w:sz w:val="20"/>
-        </w:rPr>
-        <w:t>Job seekers: each account is independent — no multi-user consideration needed.</w:t>
-      </w:r>
-    </w:p>
-    <w:p>
-      <w:pPr>
-        <w:pStyle w:val="ListBullet"/>
-        <w:spacing w:after="40"/>
-      </w:pPr>
-      <w:r>
-        <w:rPr>
-          <w:color w:val="202020"/>
-          <w:sz w:val="20"/>
-        </w:rPr>
-        <w:t xml:space="preserve">Employers: a company </w:t>
-      </w:r>
-      <w:r>
-        <w:rPr>
-          <w:color w:val="202020"/>
-          <w:sz w:val="20"/>
-        </w:rPr>
-        <w:t>exists as a shared entity but only one user (the employer) is linked to it.</w:t>
-      </w:r>
-    </w:p>
-    <w:p>
-      <w:pPr>
-        <w:spacing w:after="80"/>
-      </w:pPr>
-      <w:r>
-        <w:rPr>
-          <w:color w:val="D37B00"/>
-          <w:sz w:val="20"/>
-        </w:rPr>
-        <w:t>ℹ</w:t>
-      </w:r>
-      <w:r>
-        <w:rPr>
-          <w:color w:val="D37B00"/>
-          <w:sz w:val="20"/>
-        </w:rPr>
-        <w:t xml:space="preserve">  Adding multi-seat employer teams would require: a company_users pivot table, role-within-company column, invitations system, and scoping all employer queries through team member</w:t>
-      </w:r>
-      <w:r>
-        <w:rPr>
-          <w:color w:val="D37B00"/>
-          <w:sz w:val="20"/>
-        </w:rPr>
-        <w:t>ship.</w:t>
-      </w:r>
-    </w:p>
-    <w:p>
-      <w:pPr>
-        <w:pStyle w:val="Heading2"/>
-      </w:pPr>
-      <w:r>
-        <w:rPr>
-          <w:color w:val="202020"/>
-        </w:rPr>
-        <w:lastRenderedPageBreak/>
-        <w:t>8.2 Hardcoded Values</w:t>
-      </w:r>
-    </w:p>
-    <w:p>
-      <w:pPr>
-        <w:spacing w:after="80"/>
-      </w:pPr>
-      <w:r>
-        <w:rPr>
-          <w:b/>
-          <w:color w:val="C0392B"/>
-          <w:sz w:val="20"/>
-        </w:rPr>
-        <w:t>⚠</w:t>
-      </w:r>
-      <w:r>
-        <w:rPr>
-          <w:b/>
-          <w:color w:val="C0392B"/>
-          <w:sz w:val="20"/>
-        </w:rPr>
-        <w:t xml:space="preserve">  CRITICAL: Azure OpenAI API key (e6e0bf0c61d14319a92bbc2d2a02f52f) hardcoded in config/ai.php (line 26) and AIService.php (line 51) as fallback values. Must be rotated and removed.</w:t>
-      </w:r>
-    </w:p>
-    <w:p>
-      <w:pPr>
-        <w:spacing w:after="80"/>
-      </w:pPr>
-      <w:r>
-        <w:rPr>
-          <w:b/>
-          <w:color w:val="C0392B"/>
-          <w:sz w:val="20"/>
-        </w:rPr>
-        <w:t>⚠</w:t>
-      </w:r>
-      <w:r>
-        <w:rPr>
-          <w:b/>
-          <w:color w:val="C0392B"/>
-          <w:sz w:val="20"/>
-        </w:rPr>
-        <w:t xml:space="preserve">  CRITICAL: Azure OpenAI endpoint URL </w:t>
-      </w:r>
-      <w:r>
-        <w:rPr>
-          <w:b/>
-          <w:color w:val="C0392B"/>
-          <w:sz w:val="20"/>
-        </w:rPr>
-        <w:t>(https://studai-openai-2049701603.openai.azure.com/) hardcoded in same locations.</w:t>
+        <w:t>⚠  CRITICAL: Azure OpenAI endpoint URL (https://studai-openai-2049701603.openai.azure.com/) hardcoded in same locations.</w:t>
       </w:r>
     </w:p>
     <w:p>
@@ -16990,14 +16186,7 @@
           <w:color w:val="202020"/>
           <w:sz w:val="20"/>
         </w:rPr>
-        <w:t>Currency defaults to "INR" throughout — no internationalisation support for non-Indi</w:t>
-      </w:r>
-      <w:r>
-        <w:rPr>
-          <w:color w:val="202020"/>
-          <w:sz w:val="20"/>
-        </w:rPr>
-        <w:t>an markets.</w:t>
+        <w:t>Currency defaults to "INR" throughout — no internationalisation support for non-Indian markets.</w:t>
       </w:r>
     </w:p>
     <w:p>
@@ -17023,14 +16212,7 @@
           <w:color w:val="202020"/>
           <w:sz w:val="20"/>
         </w:rPr>
-        <w:t xml:space="preserve">Auth diagnostic route (/auth-diag) included in production routes.web.php — protected by token but should be removed or env-gated </w:t>
-      </w:r>
-      <w:r>
-        <w:rPr>
-          <w:color w:val="202020"/>
-          <w:sz w:val="20"/>
-        </w:rPr>
-        <w:t>entirely.</w:t>
+        <w:t>Auth diagnostic route (/auth-diag) included in production routes.web.php — protected by token but should be removed or env-gated entirely.</w:t>
       </w:r>
     </w:p>
     <w:p>
@@ -17204,14 +16386,7 @@
                 <w:color w:val="202020"/>
                 <w:sz w:val="18"/>
               </w:rPr>
-              <w:t>a</w:t>
-            </w:r>
-            <w:r>
-              <w:rPr>
-                <w:color w:val="202020"/>
-                <w:sz w:val="18"/>
-              </w:rPr>
-              <w:t>pp/Jobs/Agent/FollowUpJob.php</w:t>
+              <w:t>app/Jobs/Agent/FollowUpJob.php</w:t>
             </w:r>
           </w:p>
         </w:tc>
@@ -17327,14 +16502,7 @@
                 <w:color w:val="202020"/>
                 <w:sz w:val="18"/>
               </w:rPr>
-              <w:t xml:space="preserve">TODO: Send email notification to company </w:t>
-            </w:r>
-            <w:r>
-              <w:rPr>
-                <w:color w:val="202020"/>
-                <w:sz w:val="18"/>
-              </w:rPr>
-              <w:t>administrators</w:t>
+              <w:t>TODO: Send email notification to company administrators</w:t>
             </w:r>
           </w:p>
         </w:tc>
@@ -17452,14 +16620,7 @@
                 <w:color w:val="202020"/>
                 <w:sz w:val="18"/>
               </w:rPr>
-              <w:t>3</w:t>
-            </w:r>
-            <w:r>
-              <w:rPr>
-                <w:color w:val="202020"/>
-                <w:sz w:val="18"/>
-              </w:rPr>
-              <w:t>15</w:t>
+              <w:t>315</w:t>
             </w:r>
           </w:p>
         </w:tc>
@@ -17589,14 +16750,7 @@
           <w:color w:val="202020"/>
           <w:sz w:val="20"/>
         </w:rPr>
-        <w:t xml:space="preserve">No GDPR cookie </w:t>
-      </w:r>
-      <w:r>
-        <w:rPr>
-          <w:color w:val="202020"/>
-          <w:sz w:val="20"/>
-        </w:rPr>
-        <w:t>consent banner — GDPR service exists (GDPRService) but UI consent is not visible in marketing pages.</w:t>
+        <w:t>No GDPR cookie consent banner — GDPR service exists (GDPRService) but UI consent is not visible in marketing pages.</w:t>
       </w:r>
     </w:p>
     <w:p>
@@ -17622,14 +16776,7 @@
           <w:color w:val="202020"/>
           <w:sz w:val="20"/>
         </w:rPr>
-        <w:t>Email templates: ContactController</w:t>
-      </w:r>
-      <w:r>
-        <w:rPr>
-          <w:color w:val="202020"/>
-          <w:sz w:val="20"/>
-        </w:rPr>
-        <w:t xml:space="preserve"> sends no email (TODO comment) — contact form is non-functional.</w:t>
+        <w:t>Email templates: ContactController sends no email (TODO comment) — contact form is non-functional.</w:t>
       </w:r>
     </w:p>
     <w:p>
@@ -17655,14 +16802,7 @@
           <w:color w:val="202020"/>
           <w:sz w:val="20"/>
         </w:rPr>
-        <w:t>Autonomous agent approval notifications are not implemented (TODO) — users may not know when agent need</w:t>
-      </w:r>
-      <w:r>
-        <w:rPr>
-          <w:color w:val="202020"/>
-          <w:sz w:val="20"/>
-        </w:rPr>
-        <w:t>s approval.</w:t>
+        <w:t>Autonomous agent approval notifications are not implemented (TODO) — users may not know when agent needs approval.</w:t>
       </w:r>
     </w:p>
     <w:p>
@@ -17789,14 +16929,7 @@
                 <w:color w:val="202020"/>
                 <w:sz w:val="18"/>
               </w:rPr>
-              <w:t xml:space="preserve">Single-purpose business actions (CreateResume, </w:t>
-            </w:r>
-            <w:r>
-              <w:rPr>
-                <w:color w:val="202020"/>
-                <w:sz w:val="18"/>
-              </w:rPr>
-              <w:t>etc.)</w:t>
+              <w:t>Single-purpose business actions (CreateResume, etc.)</w:t>
             </w:r>
           </w:p>
         </w:tc>
@@ -17916,14 +17049,7 @@
                 <w:color w:val="202020"/>
                 <w:sz w:val="18"/>
               </w:rPr>
-              <w:t>Filament admin panel: Resources, Page</w:t>
-            </w:r>
-            <w:r>
-              <w:rPr>
-                <w:color w:val="202020"/>
-                <w:sz w:val="18"/>
-              </w:rPr>
-              <w:t>s, Widgets</w:t>
+              <w:t>Filament admin panel: Resources, Pages, Widgets</w:t>
             </w:r>
           </w:p>
         </w:tc>
@@ -18014,14 +17140,7 @@
                 <w:color w:val="202020"/>
                 <w:sz w:val="18"/>
               </w:rPr>
-              <w:t xml:space="preserve">Custom middleware (EnsureUserIsEmployer, ApiRateLimiting, </w:t>
-            </w:r>
-            <w:r>
-              <w:rPr>
-                <w:color w:val="202020"/>
-                <w:sz w:val="18"/>
-              </w:rPr>
-              <w:t>SecurityHeaders, etc.)</w:t>
+              <w:t>Custom middleware (EnsureUserIsEmployer, ApiRateLimiting, SecurityHeaders, etc.)</w:t>
             </w:r>
           </w:p>
         </w:tc>
@@ -18141,14 +17260,7 @@
                 <w:color w:val="202020"/>
                 <w:sz w:val="18"/>
               </w:rPr>
-              <w:t>Mailable class</w:t>
-            </w:r>
-            <w:r>
-              <w:rPr>
-                <w:color w:val="202020"/>
-                <w:sz w:val="18"/>
-              </w:rPr>
-              <w:t>es (CandidateHiringMail, ApplicationConfirmationMail, etc.)</w:t>
+              <w:t>Mailable classes (CandidateHiringMail, ApplicationConfirmationMail, etc.)</w:t>
             </w:r>
           </w:p>
         </w:tc>
@@ -18328,14 +17440,7 @@
                 <w:color w:val="202020"/>
                 <w:sz w:val="18"/>
               </w:rPr>
-              <w:t>Business logic services (AI/, Agent/, Ats/, Calendar/, Interview/, JobBoard/, ResponsibleAI/, Sear</w:t>
-            </w:r>
-            <w:r>
-              <w:rPr>
-                <w:color w:val="202020"/>
-                <w:sz w:val="18"/>
-              </w:rPr>
-              <w:t>ch/, Subscription/ sub-folders)</w:t>
+              <w:t>Business logic services (AI/, Agent/, Ats/, Calendar/, Interview/, JobBoard/, ResponsibleAI/, Search/, Subscription/ sub-folders)</w:t>
             </w:r>
           </w:p>
         </w:tc>
@@ -18455,14 +17560,7 @@
                 <w:color w:val="202020"/>
                 <w:sz w:val="18"/>
               </w:rPr>
-              <w:t xml:space="preserve">~140 </w:t>
-            </w:r>
-            <w:r>
-              <w:rPr>
-                <w:color w:val="202020"/>
-                <w:sz w:val="18"/>
-              </w:rPr>
-              <w:t>migration files spanning Oct 2025 – May 2026</w:t>
+              <w:t>~140 migration files spanning Oct 2025 – May 2026</w:t>
             </w:r>
           </w:p>
         </w:tc>
@@ -18568,14 +17666,7 @@
                 <w:color w:val="202020"/>
                 <w:sz w:val="18"/>
               </w:rPr>
-              <w:t>resources/vi</w:t>
-            </w:r>
-            <w:r>
-              <w:rPr>
-                <w:color w:val="202020"/>
-                <w:sz w:val="18"/>
-              </w:rPr>
-              <w:t>ews/</w:t>
+              <w:t>resources/views/</w:t>
             </w:r>
           </w:p>
         </w:tc>
@@ -18679,14 +17770,7 @@
                 <w:color w:val="202020"/>
                 <w:sz w:val="18"/>
               </w:rPr>
-              <w:t>Route files: web.php, api.php, auth.php, employer.php, resume.php, admin_</w:t>
-            </w:r>
-            <w:r>
-              <w:rPr>
-                <w:color w:val="202020"/>
-                <w:sz w:val="18"/>
-              </w:rPr>
-              <w:t>analytics.php, console.php</w:t>
+              <w:t>Route files: web.php, api.php, auth.php, employer.php, resume.php, admin_analytics.php, console.php</w:t>
             </w:r>
           </w:p>
         </w:tc>
@@ -18863,14 +17947,7 @@
                 <w:color w:val="202020"/>
                 <w:sz w:val="18"/>
               </w:rPr>
-              <w:t xml:space="preserve">Main web routes: marketing, dashboard, </w:t>
-            </w:r>
-            <w:r>
-              <w:rPr>
-                <w:color w:val="202020"/>
-                <w:sz w:val="18"/>
-              </w:rPr>
-              <w:t>jobs, career coach, payments, admin diag. Includes all sub-route files.</w:t>
+              <w:t>Main web routes: marketing, dashboard, jobs, career coach, payments, admin diag. Includes all sub-route files.</w:t>
             </w:r>
           </w:p>
         </w:tc>
@@ -18930,14 +18007,7 @@
                 <w:color w:val="202020"/>
                 <w:sz w:val="18"/>
               </w:rPr>
-              <w:t xml:space="preserve">Employer portal: dashboard, ATS, talent pool, messaging, </w:t>
-            </w:r>
-            <w:r>
-              <w:rPr>
-                <w:color w:val="202020"/>
-                <w:sz w:val="18"/>
-              </w:rPr>
-              <w:t>job wizard, referrals (all auth+employer middleware)</w:t>
+              <w:t>Employer portal: dashboard, ATS, talent pool, messaging, job wizard, referrals (all auth+employer middleware)</w:t>
             </w:r>
           </w:p>
         </w:tc>
@@ -19084,13 +18154,7 @@
         <w:rPr>
           <w:color w:val="202020"/>
         </w:rPr>
-        <w:t>10.1 PHP Dependencies (composer.jso</w:t>
-      </w:r>
-      <w:r>
-        <w:rPr>
-          <w:color w:val="202020"/>
-        </w:rPr>
-        <w:t>n — Production)</w:t>
+        <w:t>10.1 PHP Dependencies (composer.json — Production)</w:t>
       </w:r>
     </w:p>
     <w:tbl>
@@ -19617,14 +18681,7 @@
                 <w:color w:val="202020"/>
                 <w:sz w:val="18"/>
               </w:rPr>
-              <w:t xml:space="preserve">File </w:t>
-            </w:r>
-            <w:r>
-              <w:rPr>
-                <w:color w:val="202020"/>
-                <w:sz w:val="18"/>
-              </w:rPr>
-              <w:t>uploads with conversions</w:t>
+              <w:t>File uploads with conversions</w:t>
             </w:r>
           </w:p>
         </w:tc>
@@ -19856,14 +18913,7 @@
                 <w:color w:val="202020"/>
                 <w:sz w:val="18"/>
               </w:rPr>
-              <w:t>OpenA</w:t>
-            </w:r>
-            <w:r>
-              <w:rPr>
-                <w:color w:val="202020"/>
-                <w:sz w:val="18"/>
-              </w:rPr>
-              <w:t>I SDK (used as legacy shim; primary calls use direct HTTP)</w:t>
+              <w:t>OpenAI SDK (used as legacy shim; primary calls use direct HTTP)</w:t>
             </w:r>
           </w:p>
         </w:tc>
@@ -20225,14 +19275,7 @@
                 <w:color w:val="202020"/>
                 <w:sz w:val="18"/>
               </w:rPr>
-              <w:t xml:space="preserve">OK — verify live key rotation (see </w:t>
-            </w:r>
-            <w:r>
-              <w:rPr>
-                <w:color w:val="202020"/>
-                <w:sz w:val="18"/>
-              </w:rPr>
-              <w:t>security alerts)</w:t>
+              <w:t>OK — verify live key rotation (see security alerts)</w:t>
             </w:r>
           </w:p>
         </w:tc>
@@ -20450,14 +19493,7 @@
                 <w:color w:val="202020"/>
                 <w:sz w:val="18"/>
               </w:rPr>
-              <w:t xml:space="preserve">Image </w:t>
-            </w:r>
-            <w:r>
-              <w:rPr>
-                <w:color w:val="202020"/>
-                <w:sz w:val="18"/>
-              </w:rPr>
-              <w:t>resizing/optimisation</w:t>
+              <w:t>Image resizing/optimisation</w:t>
             </w:r>
           </w:p>
         </w:tc>
@@ -20661,14 +19697,7 @@
                 <w:color w:val="202020"/>
                 <w:sz w:val="18"/>
               </w:rPr>
-              <w:t>sentry</w:t>
-            </w:r>
-            <w:r>
-              <w:rPr>
-                <w:color w:val="202020"/>
-                <w:sz w:val="18"/>
-              </w:rPr>
-              <w:t>/sentry-laravel</w:t>
+              <w:t>sentry/sentry-laravel</w:t>
             </w:r>
           </w:p>
         </w:tc>
@@ -21561,14 +20590,7 @@
                 <w:color w:val="202020"/>
                 <w:sz w:val="18"/>
               </w:rPr>
-              <w:t xml:space="preserve">Tailwind form </w:t>
-            </w:r>
-            <w:r>
-              <w:rPr>
-                <w:color w:val="202020"/>
-                <w:sz w:val="18"/>
-              </w:rPr>
-              <w:t>styles</w:t>
+              <w:t>Tailwind form styles</w:t>
             </w:r>
           </w:p>
         </w:tc>
@@ -21788,14 +20810,7 @@
                 <w:color w:val="202020"/>
                 <w:sz w:val="18"/>
               </w:rPr>
-              <w:t>Run multiple dev processes</w:t>
-            </w:r>
-            <w:r>
-              <w:rPr>
-                <w:color w:val="202020"/>
-                <w:sz w:val="18"/>
-              </w:rPr>
-              <w:t xml:space="preserve"> simultaneously</w:t>
+              <w:t>Run multiple dev processes simultaneously</w:t>
             </w:r>
           </w:p>
         </w:tc>
@@ -21836,34 +20851,20 @@
           <w:color w:val="202020"/>
           <w:sz w:val="20"/>
         </w:rPr>
-        <w:t xml:space="preserve">openai-php/laravel: Only used as a compatibility shim via </w:t>
-      </w:r>
-      <w:r>
-        <w:rPr>
-          <w:color w:val="202020"/>
-          <w:sz w:val="20"/>
-        </w:rPr>
-        <w:t>OpenAIService. All real AI calls use direct HTTP to Azure. This creates a misleading dependency — consider removing the package if Orin exclusively uses Azure.</w:t>
-      </w:r>
-    </w:p>
-    <w:p>
-      <w:pPr>
-        <w:pStyle w:val="ListBullet"/>
-        <w:spacing w:after="40"/>
-      </w:pPr>
-      <w:r>
-        <w:rPr>
-          <w:color w:val="202020"/>
-          <w:sz w:val="20"/>
-        </w:rPr>
-        <w:t>laravel/telescope: Should confirm TELESCOPE_ENABLED=false in production — Telescope can add sign</w:t>
-      </w:r>
-      <w:r>
-        <w:rPr>
-          <w:color w:val="202020"/>
-          <w:sz w:val="20"/>
-        </w:rPr>
-        <w:t>ificant memory overhead.</w:t>
+        <w:t>openai-php/laravel: Only used as a compatibility shim via OpenAIService. All real AI calls use direct HTTP to Azure. This creates a misleading dependency — consider removing the package if Orin exclusively uses Azure.</w:t>
+      </w:r>
+    </w:p>
+    <w:p>
+      <w:pPr>
+        <w:pStyle w:val="ListBullet"/>
+        <w:spacing w:after="40"/>
+      </w:pPr>
+      <w:r>
+        <w:rPr>
+          <w:color w:val="202020"/>
+          <w:sz w:val="20"/>
+        </w:rPr>
+        <w:t>laravel/telescope: Should confirm TELESCOPE_ENABLED=false in production — Telescope can add significant memory overhead.</w:t>
       </w:r>
     </w:p>
     <w:p>
@@ -21889,14 +20890,7 @@
           <w:color w:val="202020"/>
           <w:sz w:val="20"/>
         </w:rPr>
-        <w:t>laravel/reverb: WebSocket server — ensure Reverb is running in production if real-time features (notifications, live c</w:t>
-      </w:r>
-      <w:r>
-        <w:rPr>
-          <w:color w:val="202020"/>
-          <w:sz w:val="20"/>
-        </w:rPr>
-        <w:t>oaching) are active.</w:t>
+        <w:t>laravel/reverb: WebSocket server — ensure Reverb is running in production if real-time features (notifications, live coaching) are active.</w:t>
       </w:r>
     </w:p>
     <w:p>
@@ -21927,15 +20921,20 @@
           <w:color w:val="C0392B"/>
           <w:sz w:val="20"/>
         </w:rPr>
-        <w:t>⚠</w:t>
-      </w:r>
+        <w:t>⚠  P0 — CRITICAL: Azure OpenAI API key hardcoded in config/ai.php and AIService.php. Rotate immediately and use env-only.</w:t>
+      </w:r>
+    </w:p>
+    <w:p>
+      <w:pPr>
+        <w:spacing w:after="80"/>
+      </w:pPr>
       <w:r>
         <w:rPr>
           <w:b/>
           <w:color w:val="C0392B"/>
           <w:sz w:val="20"/>
         </w:rPr>
-        <w:t xml:space="preserve">  P0 — CRITICAL: Azure OpenAI API key hardcoded in config/ai.php and AIService.php. Rotate immediately and use env-only.</w:t>
+        <w:t>⚠  P0 — CRITICAL: Live Razorpay API key (rzp_live_SYaE3xGta8COx9) shared in rzp-key CSV. Revoke and regenerate immediately via Razorpay dashboard.</w:t>
       </w:r>
     </w:p>
     <w:p>
@@ -21948,23 +20947,7 @@
           <w:color w:val="C0392B"/>
           <w:sz w:val="20"/>
         </w:rPr>
-        <w:t>⚠</w:t>
-      </w:r>
-      <w:r>
-        <w:rPr>
-          <w:b/>
-          <w:color w:val="C0392B"/>
-          <w:sz w:val="20"/>
-        </w:rPr>
-        <w:t xml:space="preserve">  P0 — CRITICAL: Live Razorpay API key (rzp_live_SYaE3xGta8COx9) shared i</w:t>
-      </w:r>
-      <w:r>
-        <w:rPr>
-          <w:b/>
-          <w:color w:val="C0392B"/>
-          <w:sz w:val="20"/>
-        </w:rPr>
-        <w:t>n rzp-key CSV. Revoke and regenerate immediately via Razorpay dashboard.</w:t>
+        <w:t>⚠  P1 — HIGH: /auth-diag route is live in production routes.web.php. Although protected by AUTH_DIAG_TOKEN, it exposes schema introspection, user seeding, and migration triggering capabilities. Should be removed entirely from production.</w:t>
       </w:r>
     </w:p>
     <w:p>
@@ -21973,27 +20956,10 @@
       </w:pPr>
       <w:r>
         <w:rPr>
-          <w:b/>
-          <w:color w:val="C0392B"/>
-          <w:sz w:val="20"/>
-        </w:rPr>
-        <w:t>⚠</w:t>
-      </w:r>
-      <w:r>
-        <w:rPr>
-          <w:b/>
-          <w:color w:val="C0392B"/>
-          <w:sz w:val="20"/>
-        </w:rPr>
-        <w:t xml:space="preserve">  P1 — HIGH: /auth-diag route is live in production routes.web.php. Although protected by AUTH_DIAG_TOKEN, it exposes schema introspection, user seeding, and migration triggering cap</w:t>
-      </w:r>
-      <w:r>
-        <w:rPr>
-          <w:b/>
-          <w:color w:val="C0392B"/>
-          <w:sz w:val="20"/>
-        </w:rPr>
-        <w:t>abilities. Should be removed entirely from production.</w:t>
+          <w:color w:val="D37B00"/>
+          <w:sz w:val="20"/>
+        </w:rPr>
+        <w:t>ℹ  P2 — MEDIUM: openai-php/laravel package included but primary AI calls bypass it (direct HTTP). If OPENAI_API_KEY is set, the package auto-configures — ensure it is not accidentally used with a different key.</w:t>
       </w:r>
     </w:p>
     <w:p>
@@ -22005,73 +20971,475 @@
           <w:color w:val="D37B00"/>
           <w:sz w:val="20"/>
         </w:rPr>
-        <w:t>ℹ</w:t>
-      </w:r>
+        <w:t>ℹ  P2 — MEDIUM: Phone numbers encrypted at rest (good), but verify Laravel encryption key (APP_KEY) rotation policy.</w:t>
+      </w:r>
+    </w:p>
+    <w:p>
+      <w:pPr>
+        <w:spacing w:after="80"/>
+      </w:pPr>
       <w:r>
         <w:rPr>
           <w:color w:val="D37B00"/>
           <w:sz w:val="20"/>
         </w:rPr>
-        <w:t xml:space="preserve">  P2 — MEDIUM: openai-php/laravel package included but primary AI calls bypass it (direct HTTP). If OPENAI_API_KEY is set, the package auto-configures — ensure it is not accidentally used with a diffe</w:t>
-      </w:r>
-      <w:r>
-        <w:rPr>
-          <w:color w:val="D37B00"/>
-          <w:sz w:val="20"/>
-        </w:rPr>
-        <w:t>rent key.</w:t>
-      </w:r>
-    </w:p>
-    <w:p>
-      <w:pPr>
-        <w:spacing w:after="80"/>
-      </w:pPr>
-      <w:r>
-        <w:rPr>
-          <w:color w:val="D37B00"/>
-          <w:sz w:val="20"/>
-        </w:rPr>
-        <w:t>ℹ</w:t>
-      </w:r>
-      <w:r>
-        <w:rPr>
-          <w:color w:val="D37B00"/>
-          <w:sz w:val="20"/>
-        </w:rPr>
-        <w:t xml:space="preserve">  P2 — MEDIUM: Phone numbers encrypted at rest (good), but verify Laravel encryption key (APP_KEY) rotation policy.</w:t>
-      </w:r>
-    </w:p>
-    <w:p>
-      <w:pPr>
-        <w:spacing w:after="80"/>
-      </w:pPr>
-      <w:r>
-        <w:rPr>
-          <w:color w:val="D37B00"/>
-          <w:sz w:val="20"/>
-        </w:rPr>
-        <w:t>ℹ</w:t>
-      </w:r>
-      <w:r>
-        <w:rPr>
-          <w:color w:val="D37B00"/>
-          <w:sz w:val="20"/>
-        </w:rPr>
-        <w:t xml:space="preserve">  P3 — LOW: Multiple TODO notifications mean some agent actions complete silently without user feedback.</w:t>
+        <w:t>ℹ  P3 — LOW: Multiple TODO notifications mean some agent actions complete silently without user feedback.</w:t>
       </w:r>
     </w:p>
     <w:p/>
     <w:p>
       <w:pPr>
         <w:jc w:val="center"/>
-      </w:pPr>
-      <w:r>
         <w:rPr>
           <w:i/>
           <w:color w:val="555555"/>
         </w:rPr>
+      </w:pPr>
+      <w:r>
+        <w:rPr>
+          <w:i/>
+          <w:color w:val="555555"/>
+        </w:rPr>
         <w:t>— End of Report —</w:t>
       </w:r>
+    </w:p>
+    <w:p>
+      <w:pPr>
+        <w:jc w:val="center"/>
+        <w:rPr>
+          <w:i/>
+          <w:color w:val="555555"/>
+        </w:rPr>
+      </w:pPr>
+    </w:p>
+    <w:p>
+      <w:pPr>
+        <w:jc w:val="center"/>
+        <w:rPr>
+          <w:i/>
+          <w:color w:val="555555"/>
+        </w:rPr>
+      </w:pPr>
+    </w:p>
+    <w:p>
+      <w:pPr>
+        <w:jc w:val="center"/>
+        <w:rPr>
+          <w:i/>
+          <w:color w:val="555555"/>
+        </w:rPr>
+      </w:pPr>
+      <w:r>
+        <w:rPr>
+          <w:i/>
+          <w:color w:val="555555"/>
+        </w:rPr>
+        <w:t>Srm    JOB FAIR</w:t>
+      </w:r>
+    </w:p>
+    <w:p>
+      <w:pPr>
+        <w:jc w:val="center"/>
+        <w:rPr>
+          <w:i/>
+          <w:color w:val="555555"/>
+        </w:rPr>
+      </w:pPr>
+      <w:r>
+        <w:rPr>
+          <w:i/>
+          <w:color w:val="555555"/>
+        </w:rPr>
+        <w:t>1- 8 YEARS</w:t>
+      </w:r>
+    </w:p>
+    <w:p>
+      <w:pPr>
+        <w:jc w:val="center"/>
+        <w:rPr>
+          <w:i/>
+          <w:color w:val="555555"/>
+        </w:rPr>
+      </w:pPr>
+      <w:r>
+        <w:rPr>
+          <w:i/>
+          <w:color w:val="555555"/>
+        </w:rPr>
+        <w:t>PROMPTEC COMPANY</w:t>
+      </w:r>
+    </w:p>
+    <w:p>
+      <w:pPr>
+        <w:jc w:val="center"/>
+        <w:rPr>
+          <w:i/>
+          <w:color w:val="555555"/>
+        </w:rPr>
+      </w:pPr>
+      <w:r>
+        <w:rPr>
+          <w:i/>
+          <w:color w:val="555555"/>
+        </w:rPr>
+        <w:t>Hiring 8years………………..</w:t>
+      </w:r>
+    </w:p>
+    <w:p>
+      <w:pPr>
+        <w:jc w:val="center"/>
+        <w:rPr>
+          <w:i/>
+          <w:color w:val="555555"/>
+        </w:rPr>
+      </w:pPr>
+      <w:r>
+        <w:rPr>
+          <w:i/>
+          <w:color w:val="555555"/>
+        </w:rPr>
+        <w:t>Hire</w:t>
+      </w:r>
+    </w:p>
+    <w:p>
+      <w:pPr>
+        <w:jc w:val="center"/>
+        <w:rPr>
+          <w:i/>
+          <w:color w:val="555555"/>
+        </w:rPr>
+      </w:pPr>
+      <w:r>
+        <w:rPr>
+          <w:i/>
+          <w:color w:val="555555"/>
+        </w:rPr>
+        <w:t>FREE MARKETING</w:t>
+      </w:r>
+    </w:p>
+    <w:p>
+      <w:pPr>
+        <w:jc w:val="center"/>
+        <w:rPr>
+          <w:i/>
+          <w:color w:val="555555"/>
+        </w:rPr>
+      </w:pPr>
+      <w:r>
+        <w:rPr>
+          <w:i/>
+          <w:color w:val="555555"/>
+        </w:rPr>
+        <w:t xml:space="preserve">Caption/ </w:t>
+      </w:r>
+      <w:proofErr w:type="spellStart"/>
+      <w:r>
+        <w:rPr>
+          <w:i/>
+          <w:color w:val="555555"/>
+        </w:rPr>
+        <w:t>srm</w:t>
+      </w:r>
+      <w:proofErr w:type="spellEnd"/>
+      <w:r>
+        <w:rPr>
+          <w:i/>
+          <w:color w:val="555555"/>
+        </w:rPr>
+        <w:t xml:space="preserve"> placements</w:t>
+      </w:r>
+      <w:r>
+        <w:rPr>
+          <w:i/>
+          <w:color w:val="555555"/>
+        </w:rPr>
+        <w:sym w:font="Wingdings" w:char="F0E0"/>
+      </w:r>
+      <w:r>
+        <w:rPr>
+          <w:i/>
+          <w:color w:val="555555"/>
+        </w:rPr>
+        <w:t xml:space="preserve"> StudAI login-&gt; subscriptions</w:t>
+      </w:r>
+    </w:p>
+    <w:p>
+      <w:pPr>
+        <w:jc w:val="center"/>
+        <w:rPr>
+          <w:i/>
+          <w:color w:val="555555"/>
+        </w:rPr>
+      </w:pPr>
+      <w:r>
+        <w:rPr>
+          <w:i/>
+          <w:color w:val="555555"/>
+        </w:rPr>
+        <w:t>Standalone</w:t>
+      </w:r>
+      <w:r>
+        <w:rPr>
+          <w:i/>
+          <w:color w:val="555555"/>
+        </w:rPr>
+        <w:sym w:font="Wingdings" w:char="F0E0"/>
+      </w:r>
+      <w:r>
+        <w:rPr>
+          <w:i/>
+          <w:color w:val="555555"/>
+        </w:rPr>
+        <w:t xml:space="preserve"> </w:t>
+      </w:r>
+      <w:r>
+        <w:rPr>
+          <w:i/>
+          <w:color w:val="555555"/>
+        </w:rPr>
+        <w:sym w:font="Wingdings" w:char="F0E0"/>
+      </w:r>
+      <w:r>
+        <w:rPr>
+          <w:i/>
+          <w:color w:val="555555"/>
+        </w:rPr>
+        <w:t xml:space="preserve"> hiring post internships </w:t>
+      </w:r>
+      <w:r>
+        <w:rPr>
+          <w:i/>
+          <w:color w:val="555555"/>
+        </w:rPr>
+        <w:sym w:font="Wingdings" w:char="F0E0"/>
+      </w:r>
+      <w:r>
+        <w:rPr>
+          <w:i/>
+          <w:color w:val="555555"/>
+        </w:rPr>
+        <w:t xml:space="preserve"> QR code (apply)</w:t>
+      </w:r>
+    </w:p>
+    <w:p>
+      <w:pPr>
+        <w:jc w:val="center"/>
+        <w:rPr>
+          <w:i/>
+          <w:color w:val="555555"/>
+        </w:rPr>
+      </w:pPr>
+      <w:r>
+        <w:rPr>
+          <w:i/>
+          <w:color w:val="555555"/>
+        </w:rPr>
+        <w:t>Student side larger-? College placements high</w:t>
+      </w:r>
+    </w:p>
+    <w:p>
+      <w:pPr>
+        <w:jc w:val="center"/>
+        <w:rPr>
+          <w:i/>
+          <w:color w:val="555555"/>
+        </w:rPr>
+      </w:pPr>
+      <w:r>
+        <w:rPr>
+          <w:i/>
+          <w:color w:val="555555"/>
+        </w:rPr>
+        <w:t xml:space="preserve">Useful </w:t>
+      </w:r>
+    </w:p>
+    <w:p>
+      <w:pPr>
+        <w:jc w:val="center"/>
+      </w:pPr>
+      <w:r>
+        <w:t>Login: companies, student</w:t>
+      </w:r>
+    </w:p>
+    <w:p>
+      <w:pPr>
+        <w:jc w:val="center"/>
+      </w:pPr>
+      <w:r>
+        <w:t>Responsible ai: why not eligible</w:t>
+      </w:r>
+    </w:p>
+    <w:p>
+      <w:pPr>
+        <w:jc w:val="center"/>
+        <w:rPr>
+          <w:highlight w:val="yellow"/>
+        </w:rPr>
+      </w:pPr>
+      <w:r>
+        <w:rPr>
+          <w:highlight w:val="yellow"/>
+        </w:rPr>
+        <w:t>Claude.design.ai</w:t>
+      </w:r>
+    </w:p>
+    <w:p>
+      <w:pPr>
+        <w:jc w:val="center"/>
+        <w:rPr>
+          <w:highlight w:val="yellow"/>
+        </w:rPr>
+      </w:pPr>
+      <w:proofErr w:type="spellStart"/>
+      <w:r>
+        <w:rPr>
+          <w:highlight w:val="yellow"/>
+        </w:rPr>
+        <w:t>Brandassest</w:t>
+      </w:r>
+      <w:proofErr w:type="spellEnd"/>
+      <w:r>
+        <w:rPr>
+          <w:highlight w:val="yellow"/>
+        </w:rPr>
+        <w:t xml:space="preserve"> ready panna sir</w:t>
+      </w:r>
+    </w:p>
+    <w:p>
+      <w:pPr>
+        <w:jc w:val="center"/>
+      </w:pPr>
+      <w:r>
+        <w:rPr>
+          <w:highlight w:val="yellow"/>
+        </w:rPr>
+        <w:t>For stud ai hire</w:t>
+      </w:r>
+    </w:p>
+    <w:p>
+      <w:pPr>
+        <w:jc w:val="center"/>
+      </w:pPr>
+      <w:r>
+        <w:lastRenderedPageBreak/>
+        <w:t xml:space="preserve">Cohort </w:t>
+      </w:r>
+      <w:proofErr w:type="spellStart"/>
+      <w:r>
+        <w:t>ku</w:t>
+      </w:r>
+      <w:proofErr w:type="spellEnd"/>
+      <w:r>
+        <w:t xml:space="preserve"> </w:t>
+      </w:r>
+      <w:proofErr w:type="spellStart"/>
+      <w:r>
+        <w:t>ninga</w:t>
+      </w:r>
+      <w:proofErr w:type="spellEnd"/>
+      <w:r>
+        <w:t xml:space="preserve"> work </w:t>
+      </w:r>
+      <w:proofErr w:type="spellStart"/>
+      <w:r>
+        <w:t>panningalama</w:t>
+      </w:r>
+      <w:proofErr w:type="spellEnd"/>
+    </w:p>
+    <w:p>
+      <w:pPr>
+        <w:jc w:val="center"/>
+      </w:pPr>
+      <w:r>
+        <w:t xml:space="preserve">Brand extension -&gt; click pannanum </w:t>
+      </w:r>
+    </w:p>
+    <w:p>
+      <w:pPr>
+        <w:jc w:val="center"/>
+      </w:pPr>
+      <w:r>
+        <w:t>Professional</w:t>
+      </w:r>
+      <w:r>
+        <w:t>;</w:t>
+      </w:r>
+      <w:r>
+        <w:t xml:space="preserve"> fo</w:t>
+      </w:r>
+      <w:r>
+        <w:t xml:space="preserve">nts design branding assests </w:t>
+      </w:r>
+    </w:p>
+    <w:p>
+      <w:pPr>
+        <w:jc w:val="center"/>
+      </w:pPr>
+      <w:r>
+        <w:t>--</w:t>
+      </w:r>
+    </w:p>
+    <w:p>
+      <w:pPr>
+        <w:jc w:val="center"/>
+      </w:pPr>
+      <w:r>
+        <w:t>Content</w:t>
+      </w:r>
+    </w:p>
+    <w:p>
+      <w:pPr>
+        <w:jc w:val="center"/>
+      </w:pPr>
+      <w:r>
+        <w:t>--</w:t>
+      </w:r>
+    </w:p>
+    <w:p>
+      <w:pPr>
+        <w:jc w:val="center"/>
+      </w:pPr>
+      <w:r>
+        <w:t>Claude.ai/design</w:t>
+      </w:r>
+    </w:p>
+    <w:p/>
+    <w:p>
+      <w:pPr>
+        <w:jc w:val="center"/>
+      </w:pPr>
+      <w:r>
+        <w:t>--</w:t>
+      </w:r>
+    </w:p>
+    <w:p>
+      <w:pPr>
+        <w:jc w:val="center"/>
+      </w:pPr>
+      <w:r>
+        <w:t>Logo</w:t>
+      </w:r>
+    </w:p>
+    <w:p>
+      <w:pPr>
+        <w:jc w:val="center"/>
+      </w:pPr>
+      <w:r>
+        <w:t>Zip file with logo</w:t>
+      </w:r>
+    </w:p>
+    <w:p>
+      <w:pPr>
+        <w:jc w:val="center"/>
+      </w:pPr>
+      <w:r>
+        <w:t xml:space="preserve">Zip file-&gt; Claude </w:t>
+      </w:r>
+    </w:p>
+    <w:p>
+      <w:pPr>
+        <w:jc w:val="center"/>
+      </w:pPr>
     </w:p>
     <w:sectPr>
       <w:pgSz w:w="12240" w:h="15840"/>
@@ -33989,7 +33357,7 @@
 </file>
 
 <file path=customXml/itemProps1.xml><?xml version="1.0" encoding="utf-8"?>
-<ds:datastoreItem xmlns:ds="http://schemas.openxmlformats.org/officeDocument/2006/customXml" ds:itemID="{0B4D72D9-E75B-4113-8DE5-AB1ACBE1825B}">
+<ds:datastoreItem xmlns:ds="http://schemas.openxmlformats.org/officeDocument/2006/customXml" ds:itemID="{C295C143-B110-4FF2-A9BE-DC9925B1E5AB}">
   <ds:schemaRefs>
     <ds:schemaRef ds:uri="http://schemas.openxmlformats.org/officeDocument/2006/bibliography"/>
   </ds:schemaRefs>

</xml_diff>